<commit_message>
cleanup document for preprint
</commit_message>
<xml_diff>
--- a/paper/accounting_agents_paper.docx
+++ b/paper/accounting_agents_paper.docx
@@ -4,8 +4,7 @@
   <w:body>
     <w:p>
       <w:pPr>
-        <w:pStyle w:val="Body"/>
-        <w:bidi w:val="0"/>
+        <w:pStyle w:val="Body A"/>
       </w:pPr>
       <w:r>
         <w:rPr>
@@ -22,8 +21,10 @@
     </w:p>
     <w:p>
       <w:pPr>
-        <w:pStyle w:val="Body"/>
-        <w:bidi w:val="0"/>
+        <w:pStyle w:val="Body A"/>
+        <w:rPr>
+          <w:lang w:val="de-DE"/>
+        </w:rPr>
       </w:pPr>
       <w:r>
         <w:rPr>
@@ -38,8 +39,7 @@
     </w:p>
     <w:p>
       <w:pPr>
-        <w:pStyle w:val="Body"/>
-        <w:bidi w:val="0"/>
+        <w:pStyle w:val="Body A"/>
       </w:pPr>
       <w:r>
         <w:rPr>
@@ -134,8 +134,7 @@
     </w:p>
     <w:p>
       <w:pPr>
-        <w:pStyle w:val="Body"/>
-        <w:bidi w:val="0"/>
+        <w:pStyle w:val="Body A"/>
       </w:pPr>
       <w:r>
         <w:rPr>
@@ -194,8 +193,10 @@
     </w:p>
     <w:p>
       <w:pPr>
-        <w:pStyle w:val="Body"/>
-        <w:bidi w:val="0"/>
+        <w:pStyle w:val="Body A"/>
+        <w:rPr>
+          <w:lang w:val="de-DE"/>
+        </w:rPr>
       </w:pPr>
       <w:r>
         <w:rPr>
@@ -212,8 +213,7 @@
     </w:p>
     <w:p>
       <w:pPr>
-        <w:pStyle w:val="Body"/>
-        <w:bidi w:val="0"/>
+        <w:pStyle w:val="Body A"/>
       </w:pPr>
       <w:r>
         <w:rPr>
@@ -328,8 +328,7 @@
     </w:p>
     <w:p>
       <w:pPr>
-        <w:pStyle w:val="Body"/>
-        <w:bidi w:val="0"/>
+        <w:pStyle w:val="Body A"/>
       </w:pPr>
       <w:r>
         <w:rPr>
@@ -476,8 +475,7 @@
     </w:p>
     <w:p>
       <w:pPr>
-        <w:pStyle w:val="Body"/>
-        <w:bidi w:val="0"/>
+        <w:pStyle w:val="Body A"/>
       </w:pPr>
     </w:p>
     <w:p>
@@ -554,7 +552,45 @@
             </w14:solidFill>
           </w14:textFill>
         </w:rPr>
-        <w:t xml:space="preserve"> established a compelling paradigm: modelling the multi-agent decision process of a professional trading firm, with specialized roles for analysts, researchers, traders, and risk managers communicating through structured state rather than unstructured natural language. This design addresses two fundamental limitations of prior systems — the absence of realistic organizational modelling, and the "telephone effect" of context corruption across long natural language histories.</w:t>
+        <w:t xml:space="preserve"> established a compelling paradigm: modelling the multi-agent decision process of a professional trading firm, with specialized roles for analysts, researchers, traders, and risk managers communicating through structured state rather than unstructured natural language. This design addresses two fundamental limitations of prior systems </w:t>
+      </w:r>
+      <w:r>
+        <w:rPr>
+          <w:b w:val="0"/>
+          <w:bCs w:val="0"/>
+          <w:outline w:val="0"/>
+          <w:color w:val="000000"/>
+          <w:sz w:val="20"/>
+          <w:szCs w:val="20"/>
+          <w:u w:color="000000"/>
+          <w:rtl w:val="0"/>
+          <w:lang w:val="en-US"/>
+          <w14:textFill>
+            <w14:solidFill>
+              <w14:srgbClr w14:val="000000"/>
+            </w14:solidFill>
+          </w14:textFill>
+        </w:rPr>
+        <w:t xml:space="preserve">— </w:t>
+      </w:r>
+      <w:r>
+        <w:rPr>
+          <w:b w:val="0"/>
+          <w:bCs w:val="0"/>
+          <w:outline w:val="0"/>
+          <w:color w:val="000000"/>
+          <w:sz w:val="20"/>
+          <w:szCs w:val="20"/>
+          <w:u w:color="000000"/>
+          <w:rtl w:val="0"/>
+          <w:lang w:val="en-US"/>
+          <w14:textFill>
+            <w14:solidFill>
+              <w14:srgbClr w14:val="000000"/>
+            </w14:solidFill>
+          </w14:textFill>
+        </w:rPr>
+        <w:t>the absence of realistic organizational modelling, and the "telephone effect" of context corruption across long natural language histories.</w:t>
       </w:r>
     </w:p>
     <w:p>
@@ -579,7 +615,83 @@
             </w14:solidFill>
           </w14:textFill>
         </w:rPr>
-        <w:t xml:space="preserve">We observe that the accounting profession presents an analogous opportunity. A typical accounting firm processes hundreds of documents weekly — invoices, bank statements, tax filings, client correspondence — executing workflows that are highly structured, role-based, and subject to strict regulatory constraints. Despite a booming market for AI-assisted accounting (projected at $96.69B by 2033 </w:t>
+        <w:t xml:space="preserve">We observe that the accounting profession presents an analogous opportunity. A typical accounting firm processes hundreds of documents weekly </w:t>
+      </w:r>
+      <w:r>
+        <w:rPr>
+          <w:b w:val="0"/>
+          <w:bCs w:val="0"/>
+          <w:outline w:val="0"/>
+          <w:color w:val="000000"/>
+          <w:sz w:val="20"/>
+          <w:szCs w:val="20"/>
+          <w:u w:color="000000"/>
+          <w:rtl w:val="0"/>
+          <w:lang w:val="en-US"/>
+          <w14:textFill>
+            <w14:solidFill>
+              <w14:srgbClr w14:val="000000"/>
+            </w14:solidFill>
+          </w14:textFill>
+        </w:rPr>
+        <w:t xml:space="preserve">— </w:t>
+      </w:r>
+      <w:r>
+        <w:rPr>
+          <w:b w:val="0"/>
+          <w:bCs w:val="0"/>
+          <w:outline w:val="0"/>
+          <w:color w:val="000000"/>
+          <w:sz w:val="20"/>
+          <w:szCs w:val="20"/>
+          <w:u w:color="000000"/>
+          <w:rtl w:val="0"/>
+          <w:lang w:val="en-US"/>
+          <w14:textFill>
+            <w14:solidFill>
+              <w14:srgbClr w14:val="000000"/>
+            </w14:solidFill>
+          </w14:textFill>
+        </w:rPr>
+        <w:t xml:space="preserve">invoices, bank statements, tax filings, client correspondence </w:t>
+      </w:r>
+      <w:r>
+        <w:rPr>
+          <w:b w:val="0"/>
+          <w:bCs w:val="0"/>
+          <w:outline w:val="0"/>
+          <w:color w:val="000000"/>
+          <w:sz w:val="20"/>
+          <w:szCs w:val="20"/>
+          <w:u w:color="000000"/>
+          <w:rtl w:val="0"/>
+          <w:lang w:val="en-US"/>
+          <w14:textFill>
+            <w14:solidFill>
+              <w14:srgbClr w14:val="000000"/>
+            </w14:solidFill>
+          </w14:textFill>
+        </w:rPr>
+        <w:t xml:space="preserve">— </w:t>
+      </w:r>
+      <w:r>
+        <w:rPr>
+          <w:b w:val="0"/>
+          <w:bCs w:val="0"/>
+          <w:outline w:val="0"/>
+          <w:color w:val="000000"/>
+          <w:sz w:val="20"/>
+          <w:szCs w:val="20"/>
+          <w:u w:color="000000"/>
+          <w:rtl w:val="0"/>
+          <w:lang w:val="en-US"/>
+          <w14:textFill>
+            <w14:solidFill>
+              <w14:srgbClr w14:val="000000"/>
+            </w14:solidFill>
+          </w14:textFill>
+        </w:rPr>
+        <w:t xml:space="preserve">executing workflows that are highly structured, role-based, and subject to strict regulatory constraints. Despite a booming market for AI-assisted accounting (projected at $96.69B by 2033 </w:t>
       </w:r>
       <w:r>
         <w:rPr>
@@ -618,13 +730,197 @@
             </w14:solidFill>
           </w14:textFill>
         </w:rPr>
-        <w:t>), existing solutions are either monolithic commercial products with vendor lock-in, or isolated single-agent tools that address narrow tasks without organizational coherence.</w:t>
+        <w:t xml:space="preserve">), existing solutions are either monolithic commercial products with vendor lock-in, or isolated single-agent tools that address narrow tasks without organizational coherence. The breadth of AI technologies applicable to Finance and Accounting </w:t>
+      </w:r>
+      <w:r>
+        <w:rPr>
+          <w:b w:val="0"/>
+          <w:bCs w:val="0"/>
+          <w:outline w:val="0"/>
+          <w:color w:val="000000"/>
+          <w:sz w:val="20"/>
+          <w:szCs w:val="20"/>
+          <w:u w:color="000000"/>
+          <w:rtl w:val="0"/>
+          <w:lang w:val="en-US"/>
+          <w14:textFill>
+            <w14:solidFill>
+              <w14:srgbClr w14:val="000000"/>
+            </w14:solidFill>
+          </w14:textFill>
+        </w:rPr>
+        <w:t xml:space="preserve">— </w:t>
+      </w:r>
+      <w:r>
+        <w:rPr>
+          <w:b w:val="0"/>
+          <w:bCs w:val="0"/>
+          <w:outline w:val="0"/>
+          <w:color w:val="000000"/>
+          <w:sz w:val="20"/>
+          <w:szCs w:val="20"/>
+          <w:u w:color="000000"/>
+          <w:rtl w:val="0"/>
+          <w:lang w:val="en-US"/>
+          <w14:textFill>
+            <w14:solidFill>
+              <w14:srgbClr w14:val="000000"/>
+            </w14:solidFill>
+          </w14:textFill>
+        </w:rPr>
+        <w:t xml:space="preserve">including multi-agent systems, reinforcement learning, graph neural networks, and neuro-symbolic AI </w:t>
+      </w:r>
+      <w:r>
+        <w:rPr>
+          <w:b w:val="0"/>
+          <w:bCs w:val="0"/>
+          <w:outline w:val="0"/>
+          <w:color w:val="000000"/>
+          <w:sz w:val="20"/>
+          <w:szCs w:val="20"/>
+          <w:u w:color="000000"/>
+          <w:rtl w:val="0"/>
+          <w:lang w:val="en-US"/>
+          <w14:textFill>
+            <w14:solidFill>
+              <w14:srgbClr w14:val="000000"/>
+            </w14:solidFill>
+          </w14:textFill>
+        </w:rPr>
+        <w:t xml:space="preserve">— </w:t>
+      </w:r>
+      <w:r>
+        <w:rPr>
+          <w:b w:val="0"/>
+          <w:bCs w:val="0"/>
+          <w:outline w:val="0"/>
+          <w:color w:val="000000"/>
+          <w:sz w:val="20"/>
+          <w:szCs w:val="20"/>
+          <w:u w:color="000000"/>
+          <w:rtl w:val="0"/>
+          <w:lang w:val="en-US"/>
+          <w14:textFill>
+            <w14:solidFill>
+              <w14:srgbClr w14:val="000000"/>
+            </w14:solidFill>
+          </w14:textFill>
+        </w:rPr>
+        <w:t>has been extensively surveyed by Ramachandran [11], confirming both the maturity of the underlying technologies and the scale of the automation opportunity. AccountingAgents addresses this opportunity through a concrete, opinionated framework targeting the specific organizational structure and operational constraints of small-to-medium accounting firms.</w:t>
       </w:r>
     </w:p>
     <w:p>
       <w:pPr>
         <w:pStyle w:val="Heading"/>
         <w:spacing w:before="240"/>
+        <w:rPr>
+          <w:lang w:val="en-US"/>
+        </w:rPr>
+      </w:pPr>
+      <w:r>
+        <w:rPr>
+          <w:b w:val="0"/>
+          <w:bCs w:val="0"/>
+          <w:outline w:val="0"/>
+          <w:color w:val="000000"/>
+          <w:sz w:val="20"/>
+          <w:szCs w:val="20"/>
+          <w:u w:color="000000"/>
+          <w:rtl w:val="0"/>
+          <w:lang w:val="en-US"/>
+          <w14:textFill>
+            <w14:solidFill>
+              <w14:srgbClr w14:val="000000"/>
+            </w14:solidFill>
+          </w14:textFill>
+        </w:rPr>
+        <w:t xml:space="preserve">Beyond automation capability, deployment in regulated environments demands that every agent action be traceable and attributable. Barrak </w:t>
+      </w:r>
+      <w:r>
+        <w:rPr>
+          <w:b w:val="0"/>
+          <w:bCs w:val="0"/>
+          <w:outline w:val="0"/>
+          <w:color w:val="000000"/>
+          <w:sz w:val="16"/>
+          <w:szCs w:val="16"/>
+          <w:u w:color="000000"/>
+          <w:vertAlign w:val="superscript"/>
+          <w:rtl w:val="0"/>
+          <w:lang w:val="en-US"/>
+          <w14:textFill>
+            <w14:solidFill>
+              <w14:srgbClr w14:val="000000"/>
+            </w14:solidFill>
+          </w14:textFill>
+        </w:rPr>
+        <w:t>[12]</w:t>
+      </w:r>
+      <w:r>
+        <w:rPr>
+          <w:b w:val="0"/>
+          <w:bCs w:val="0"/>
+          <w:outline w:val="0"/>
+          <w:color w:val="000000"/>
+          <w:sz w:val="20"/>
+          <w:szCs w:val="20"/>
+          <w:u w:color="000000"/>
+          <w:rtl w:val="0"/>
+          <w:lang w:val="en-US"/>
+          <w14:textFill>
+            <w14:solidFill>
+              <w14:srgbClr w14:val="000000"/>
+            </w14:solidFill>
+          </w14:textFill>
+        </w:rPr>
+        <w:t xml:space="preserve"> demonstrates empirically that structured handoffs between role-specialized agents prevent silent error propagation and improve system reliability </w:t>
+      </w:r>
+      <w:r>
+        <w:rPr>
+          <w:b w:val="0"/>
+          <w:bCs w:val="0"/>
+          <w:outline w:val="0"/>
+          <w:color w:val="000000"/>
+          <w:sz w:val="20"/>
+          <w:szCs w:val="20"/>
+          <w:u w:color="000000"/>
+          <w:rtl w:val="0"/>
+          <w:lang w:val="en-US"/>
+          <w14:textFill>
+            <w14:solidFill>
+              <w14:srgbClr w14:val="000000"/>
+            </w14:solidFill>
+          </w14:textFill>
+        </w:rPr>
+        <w:t xml:space="preserve">— </w:t>
+      </w:r>
+      <w:r>
+        <w:rPr>
+          <w:b w:val="0"/>
+          <w:bCs w:val="0"/>
+          <w:outline w:val="0"/>
+          <w:color w:val="000000"/>
+          <w:sz w:val="20"/>
+          <w:szCs w:val="20"/>
+          <w:u w:color="000000"/>
+          <w:rtl w:val="0"/>
+          <w:lang w:val="en-US"/>
+          <w14:textFill>
+            <w14:solidFill>
+              <w14:srgbClr w14:val="000000"/>
+            </w14:solidFill>
+          </w14:textFill>
+        </w:rPr>
+        <w:t>a finding directly applicable to accounting workflows where errors carry fiduciary and legal consequences. AccountingAgents addresses this requirement by design, through a SharedState architecture that makes every agent delta auditable and a HITL escalation model that ensures human authorization of high-stakes actions.</w:t>
+      </w:r>
+    </w:p>
+    <w:p>
+      <w:pPr>
+        <w:pStyle w:val="Heading"/>
+        <w:spacing w:before="240"/>
+        <w:rPr>
+          <w:lang w:val="en-US"/>
+        </w:rPr>
       </w:pPr>
       <w:r>
         <w:rPr>
@@ -689,8 +985,12 @@
           <w:ilvl w:val="0"/>
           <w:numId w:val="2"/>
         </w:numPr>
+        <w:bidi w:val="0"/>
         <w:spacing w:after="80"/>
-        <w:rPr>
+        <w:ind w:right="0"/>
+        <w:jc w:val="left"/>
+        <w:rPr>
+          <w:rtl w:val="0"/>
           <w:lang w:val="en-US"/>
         </w:rPr>
       </w:pPr>
@@ -717,8 +1017,12 @@
           <w:ilvl w:val="0"/>
           <w:numId w:val="2"/>
         </w:numPr>
+        <w:bidi w:val="0"/>
         <w:spacing w:after="80"/>
-        <w:rPr>
+        <w:ind w:right="0"/>
+        <w:jc w:val="left"/>
+        <w:rPr>
+          <w:rtl w:val="0"/>
           <w:lang w:val="en-US"/>
         </w:rPr>
       </w:pPr>
@@ -745,8 +1049,12 @@
           <w:ilvl w:val="0"/>
           <w:numId w:val="2"/>
         </w:numPr>
+        <w:bidi w:val="0"/>
         <w:spacing w:after="80"/>
-        <w:rPr>
+        <w:ind w:right="0"/>
+        <w:jc w:val="left"/>
+        <w:rPr>
+          <w:rtl w:val="0"/>
           <w:lang w:val="en-US"/>
         </w:rPr>
       </w:pPr>
@@ -773,8 +1081,12 @@
           <w:ilvl w:val="0"/>
           <w:numId w:val="2"/>
         </w:numPr>
+        <w:bidi w:val="0"/>
         <w:spacing w:after="80"/>
-        <w:rPr>
+        <w:ind w:right="0"/>
+        <w:jc w:val="left"/>
+        <w:rPr>
+          <w:rtl w:val="0"/>
           <w:lang w:val="en-US"/>
         </w:rPr>
       </w:pPr>
@@ -801,8 +1113,12 @@
           <w:ilvl w:val="0"/>
           <w:numId w:val="2"/>
         </w:numPr>
+        <w:bidi w:val="0"/>
         <w:spacing w:after="80"/>
-        <w:rPr>
+        <w:ind w:right="0"/>
+        <w:jc w:val="left"/>
+        <w:rPr>
+          <w:rtl w:val="0"/>
           <w:lang w:val="en-US"/>
         </w:rPr>
       </w:pPr>
@@ -832,6 +1148,9 @@
       <w:pPr>
         <w:pStyle w:val="Heading"/>
         <w:spacing w:before="240"/>
+        <w:rPr>
+          <w:lang w:val="en-US"/>
+        </w:rPr>
       </w:pPr>
       <w:r>
         <w:rPr>
@@ -915,7 +1234,83 @@
             </w14:solidFill>
           </w14:textFill>
         </w:rPr>
-        <w:t xml:space="preserve"> proposes a stock trading framework with five specialized teams — Analysts, Researchers (Bull/Bear debaters), Traders, Risk Managers, and a Fund Manager — communicating via structured outputs. This design yields measurable improvements in Sharpe ratio and maximum drawdown over single-agent baselines. FinDebate </w:t>
+        <w:t xml:space="preserve"> proposes a stock trading framework with five specialized teams </w:t>
+      </w:r>
+      <w:r>
+        <w:rPr>
+          <w:b w:val="0"/>
+          <w:bCs w:val="0"/>
+          <w:outline w:val="0"/>
+          <w:color w:val="000000"/>
+          <w:sz w:val="20"/>
+          <w:szCs w:val="20"/>
+          <w:u w:color="000000"/>
+          <w:rtl w:val="0"/>
+          <w:lang w:val="en-US"/>
+          <w14:textFill>
+            <w14:solidFill>
+              <w14:srgbClr w14:val="000000"/>
+            </w14:solidFill>
+          </w14:textFill>
+        </w:rPr>
+        <w:t xml:space="preserve">— </w:t>
+      </w:r>
+      <w:r>
+        <w:rPr>
+          <w:b w:val="0"/>
+          <w:bCs w:val="0"/>
+          <w:outline w:val="0"/>
+          <w:color w:val="000000"/>
+          <w:sz w:val="20"/>
+          <w:szCs w:val="20"/>
+          <w:u w:color="000000"/>
+          <w:rtl w:val="0"/>
+          <w:lang w:val="en-US"/>
+          <w14:textFill>
+            <w14:solidFill>
+              <w14:srgbClr w14:val="000000"/>
+            </w14:solidFill>
+          </w14:textFill>
+        </w:rPr>
+        <w:t xml:space="preserve">Analysts, Researchers (Bull/Bear debaters), Traders, Risk Managers, and a Fund Manager </w:t>
+      </w:r>
+      <w:r>
+        <w:rPr>
+          <w:b w:val="0"/>
+          <w:bCs w:val="0"/>
+          <w:outline w:val="0"/>
+          <w:color w:val="000000"/>
+          <w:sz w:val="20"/>
+          <w:szCs w:val="20"/>
+          <w:u w:color="000000"/>
+          <w:rtl w:val="0"/>
+          <w:lang w:val="en-US"/>
+          <w14:textFill>
+            <w14:solidFill>
+              <w14:srgbClr w14:val="000000"/>
+            </w14:solidFill>
+          </w14:textFill>
+        </w:rPr>
+        <w:t xml:space="preserve">— </w:t>
+      </w:r>
+      <w:r>
+        <w:rPr>
+          <w:b w:val="0"/>
+          <w:bCs w:val="0"/>
+          <w:outline w:val="0"/>
+          <w:color w:val="000000"/>
+          <w:sz w:val="20"/>
+          <w:szCs w:val="20"/>
+          <w:u w:color="000000"/>
+          <w:rtl w:val="0"/>
+          <w:lang w:val="en-US"/>
+          <w14:textFill>
+            <w14:solidFill>
+              <w14:srgbClr w14:val="000000"/>
+            </w14:solidFill>
+          </w14:textFill>
+        </w:rPr>
+        <w:t xml:space="preserve">communicating via structured outputs. This design yields measurable improvements in Sharpe ratio and maximum drawdown over single-agent baselines. FinDebate </w:t>
       </w:r>
       <w:r>
         <w:rPr>
@@ -1349,11 +1744,298 @@
         <w:pStyle w:val="Heading 2"/>
         <w:spacing w:before="240" w:after="120"/>
       </w:pPr>
+      <w:r>
+        <w:rPr>
+          <w:rtl w:val="0"/>
+          <w:lang w:val="en-US"/>
+        </w:rPr>
+        <w:t>2.4 Traceability and Accountability in Multi-Agent Systems</w:t>
+      </w:r>
+    </w:p>
+    <w:p>
+      <w:pPr>
+        <w:pStyle w:val="Heading 2"/>
+        <w:spacing w:before="240" w:after="120"/>
+      </w:pPr>
+      <w:r>
+        <w:rPr>
+          <w:b w:val="0"/>
+          <w:bCs w:val="0"/>
+          <w:outline w:val="0"/>
+          <w:color w:val="000000"/>
+          <w:sz w:val="20"/>
+          <w:szCs w:val="20"/>
+          <w:u w:color="000000"/>
+          <w:rtl w:val="0"/>
+          <w:lang w:val="en-US"/>
+          <w14:textFill>
+            <w14:solidFill>
+              <w14:srgbClr w14:val="000000"/>
+            </w14:solidFill>
+          </w14:textFill>
+        </w:rPr>
+        <w:t xml:space="preserve">Traceability and accountability are foundational requirements in regulated environments such as accounting, where every financial action must be auditable and attributable. Barrak </w:t>
+      </w:r>
+      <w:r>
+        <w:rPr>
+          <w:b w:val="0"/>
+          <w:bCs w:val="0"/>
+          <w:outline w:val="0"/>
+          <w:color w:val="000000"/>
+          <w:sz w:val="16"/>
+          <w:szCs w:val="16"/>
+          <w:u w:color="000000"/>
+          <w:vertAlign w:val="superscript"/>
+          <w:rtl w:val="0"/>
+          <w:lang w:val="en-US"/>
+          <w14:textFill>
+            <w14:solidFill>
+              <w14:srgbClr w14:val="000000"/>
+            </w14:solidFill>
+          </w14:textFill>
+        </w:rPr>
+        <w:t>[12]</w:t>
+      </w:r>
+      <w:r>
+        <w:rPr>
+          <w:b w:val="0"/>
+          <w:bCs w:val="0"/>
+          <w:outline w:val="0"/>
+          <w:color w:val="000000"/>
+          <w:sz w:val="20"/>
+          <w:szCs w:val="20"/>
+          <w:u w:color="000000"/>
+          <w:rtl w:val="0"/>
+          <w:lang w:val="en-US"/>
+          <w14:textFill>
+            <w14:solidFill>
+              <w14:srgbClr w14:val="000000"/>
+            </w14:solidFill>
+          </w14:textFill>
+        </w:rPr>
+        <w:t xml:space="preserve"> empirically demonstrates that structured, accountable handoffs between role-specialized agents markedly improve accuracy and prevent the silent propagation of errors common in naive pipelines. Their Planner </w:t>
+      </w:r>
+      <w:r>
+        <w:rPr>
+          <w:b w:val="0"/>
+          <w:bCs w:val="0"/>
+          <w:outline w:val="0"/>
+          <w:color w:val="000000"/>
+          <w:sz w:val="20"/>
+          <w:szCs w:val="20"/>
+          <w:u w:color="000000"/>
+          <w:rtl w:val="0"/>
+          <w:lang w:val="en-US"/>
+          <w14:textFill>
+            <w14:solidFill>
+              <w14:srgbClr w14:val="000000"/>
+            </w14:solidFill>
+          </w14:textFill>
+        </w:rPr>
+        <w:t xml:space="preserve">→ </w:t>
+      </w:r>
+      <w:r>
+        <w:rPr>
+          <w:b w:val="0"/>
+          <w:bCs w:val="0"/>
+          <w:outline w:val="0"/>
+          <w:color w:val="000000"/>
+          <w:sz w:val="20"/>
+          <w:szCs w:val="20"/>
+          <w:u w:color="000000"/>
+          <w:rtl w:val="0"/>
+          <w:lang w:val="en-US"/>
+          <w14:textFill>
+            <w14:solidFill>
+              <w14:srgbClr w14:val="000000"/>
+            </w14:solidFill>
+          </w14:textFill>
+        </w:rPr>
+        <w:t xml:space="preserve">Executor </w:t>
+      </w:r>
+      <w:r>
+        <w:rPr>
+          <w:b w:val="0"/>
+          <w:bCs w:val="0"/>
+          <w:outline w:val="0"/>
+          <w:color w:val="000000"/>
+          <w:sz w:val="20"/>
+          <w:szCs w:val="20"/>
+          <w:u w:color="000000"/>
+          <w:rtl w:val="0"/>
+          <w:lang w:val="en-US"/>
+          <w14:textFill>
+            <w14:solidFill>
+              <w14:srgbClr w14:val="000000"/>
+            </w14:solidFill>
+          </w14:textFill>
+        </w:rPr>
+        <w:t xml:space="preserve">→ </w:t>
+      </w:r>
+      <w:r>
+        <w:rPr>
+          <w:b w:val="0"/>
+          <w:bCs w:val="0"/>
+          <w:outline w:val="0"/>
+          <w:color w:val="000000"/>
+          <w:sz w:val="20"/>
+          <w:szCs w:val="20"/>
+          <w:u w:color="000000"/>
+          <w:rtl w:val="0"/>
+          <w:lang w:val="en-US"/>
+          <w14:textFill>
+            <w14:solidFill>
+              <w14:srgbClr w14:val="000000"/>
+            </w14:solidFill>
+          </w14:textFill>
+        </w:rPr>
+        <w:t>Critic architecture shows that saving records of who did what at each step is not merely a governance concern but a direct driver of system reliability. AccountingAgents inherits this principle through two complementary mechanisms: (1) the SharedState architecture, where each agent writes only its own delta, creating an implicit, auditable trail of every decision and transformation; and (2) the four-level HITL escalation model (N1</w:t>
+      </w:r>
+      <w:r>
+        <w:rPr>
+          <w:b w:val="0"/>
+          <w:bCs w:val="0"/>
+          <w:outline w:val="0"/>
+          <w:color w:val="000000"/>
+          <w:sz w:val="20"/>
+          <w:szCs w:val="20"/>
+          <w:u w:color="000000"/>
+          <w:rtl w:val="0"/>
+          <w:lang w:val="en-US"/>
+          <w14:textFill>
+            <w14:solidFill>
+              <w14:srgbClr w14:val="000000"/>
+            </w14:solidFill>
+          </w14:textFill>
+        </w:rPr>
+        <w:t>–</w:t>
+      </w:r>
+      <w:r>
+        <w:rPr>
+          <w:b w:val="0"/>
+          <w:bCs w:val="0"/>
+          <w:outline w:val="0"/>
+          <w:color w:val="000000"/>
+          <w:sz w:val="20"/>
+          <w:szCs w:val="20"/>
+          <w:u w:color="000000"/>
+          <w:rtl w:val="0"/>
+          <w:lang w:val="en-US"/>
+          <w14:textFill>
+            <w14:solidFill>
+              <w14:srgbClr w14:val="000000"/>
+            </w14:solidFill>
+          </w14:textFill>
+        </w:rPr>
+        <w:t xml:space="preserve">N4), which ensures that high-stakes actions </w:t>
+      </w:r>
+      <w:r>
+        <w:rPr>
+          <w:b w:val="0"/>
+          <w:bCs w:val="0"/>
+          <w:outline w:val="0"/>
+          <w:color w:val="000000"/>
+          <w:sz w:val="20"/>
+          <w:szCs w:val="20"/>
+          <w:u w:color="000000"/>
+          <w:rtl w:val="0"/>
+          <w:lang w:val="en-US"/>
+          <w14:textFill>
+            <w14:solidFill>
+              <w14:srgbClr w14:val="000000"/>
+            </w14:solidFill>
+          </w14:textFill>
+        </w:rPr>
+        <w:t xml:space="preserve">— </w:t>
+      </w:r>
+      <w:r>
+        <w:rPr>
+          <w:b w:val="0"/>
+          <w:bCs w:val="0"/>
+          <w:outline w:val="0"/>
+          <w:color w:val="000000"/>
+          <w:sz w:val="20"/>
+          <w:szCs w:val="20"/>
+          <w:u w:color="000000"/>
+          <w:rtl w:val="0"/>
+          <w:lang w:val="en-US"/>
+          <w14:textFill>
+            <w14:solidFill>
+              <w14:srgbClr w14:val="000000"/>
+            </w14:solidFill>
+          </w14:textFill>
+        </w:rPr>
+        <w:t xml:space="preserve">vendor payments, AR escalations, reconciliation corrections </w:t>
+      </w:r>
+      <w:r>
+        <w:rPr>
+          <w:b w:val="0"/>
+          <w:bCs w:val="0"/>
+          <w:outline w:val="0"/>
+          <w:color w:val="000000"/>
+          <w:sz w:val="20"/>
+          <w:szCs w:val="20"/>
+          <w:u w:color="000000"/>
+          <w:rtl w:val="0"/>
+          <w:lang w:val="en-US"/>
+          <w14:textFill>
+            <w14:solidFill>
+              <w14:srgbClr w14:val="000000"/>
+            </w14:solidFill>
+          </w14:textFill>
+        </w:rPr>
+        <w:t xml:space="preserve">— </w:t>
+      </w:r>
+      <w:r>
+        <w:rPr>
+          <w:b w:val="0"/>
+          <w:bCs w:val="0"/>
+          <w:outline w:val="0"/>
+          <w:color w:val="000000"/>
+          <w:sz w:val="20"/>
+          <w:szCs w:val="20"/>
+          <w:u w:color="000000"/>
+          <w:rtl w:val="0"/>
+          <w:lang w:val="en-US"/>
+          <w14:textFill>
+            <w14:solidFill>
+              <w14:srgbClr w14:val="000000"/>
+            </w14:solidFill>
+          </w14:textFill>
+        </w:rPr>
+        <w:t>are explicitly authorized before execution and logged upon completion.</w:t>
+      </w:r>
+    </w:p>
+    <w:p>
+      <w:pPr>
+        <w:pStyle w:val="Heading 2"/>
+        <w:spacing w:before="240" w:after="120"/>
+      </w:pPr>
     </w:p>
     <w:p>
       <w:pPr>
         <w:pStyle w:val="Heading"/>
         <w:spacing w:before="240"/>
+      </w:pPr>
+      <w:r>
+        <w:rPr>
+          <w:rFonts w:ascii="Arial Unicode MS" w:cs="Arial Unicode MS" w:hAnsi="Arial Unicode MS" w:eastAsia="Arial Unicode MS"/>
+          <w:b w:val="0"/>
+          <w:bCs w:val="0"/>
+          <w:i w:val="0"/>
+          <w:iCs w:val="0"/>
+          <w:lang w:val="en-US"/>
+        </w:rPr>
+        <w:br w:type="page"/>
+      </w:r>
+    </w:p>
+    <w:p>
+      <w:pPr>
+        <w:pStyle w:val="Heading"/>
+        <w:spacing w:before="240"/>
+        <w:rPr>
+          <w:lang w:val="en-US"/>
+        </w:rPr>
       </w:pPr>
       <w:r>
         <w:rPr>
@@ -1408,8 +2090,12 @@
           <w:ilvl w:val="0"/>
           <w:numId w:val="2"/>
         </w:numPr>
+        <w:bidi w:val="0"/>
         <w:spacing w:after="80"/>
-        <w:rPr>
+        <w:ind w:right="0"/>
+        <w:jc w:val="left"/>
+        <w:rPr>
+          <w:rtl w:val="0"/>
           <w:lang w:val="en-US"/>
         </w:rPr>
       </w:pPr>
@@ -1436,8 +2122,12 @@
           <w:ilvl w:val="0"/>
           <w:numId w:val="2"/>
         </w:numPr>
+        <w:bidi w:val="0"/>
         <w:spacing w:after="80"/>
-        <w:rPr>
+        <w:ind w:right="0"/>
+        <w:jc w:val="left"/>
+        <w:rPr>
+          <w:rtl w:val="0"/>
           <w:lang w:val="en-US"/>
         </w:rPr>
       </w:pPr>
@@ -1464,8 +2154,12 @@
           <w:ilvl w:val="0"/>
           <w:numId w:val="2"/>
         </w:numPr>
+        <w:bidi w:val="0"/>
         <w:spacing w:after="80"/>
-        <w:rPr>
+        <w:ind w:right="0"/>
+        <w:jc w:val="left"/>
+        <w:rPr>
+          <w:rtl w:val="0"/>
           <w:lang w:val="en-US"/>
         </w:rPr>
       </w:pPr>
@@ -1592,6 +2286,26 @@
       </w:pPr>
       <w:r>
         <w:rPr>
+          <w:rFonts w:ascii="Arial Unicode MS" w:cs="Arial Unicode MS" w:hAnsi="Arial Unicode MS" w:eastAsia="Arial Unicode MS"/>
+          <w:b w:val="0"/>
+          <w:bCs w:val="0"/>
+          <w:i w:val="0"/>
+          <w:iCs w:val="0"/>
+          <w:lang w:val="fr-FR"/>
+        </w:rPr>
+        <w:br w:type="page"/>
+      </w:r>
+    </w:p>
+    <w:p>
+      <w:pPr>
+        <w:pStyle w:val="Heading 2"/>
+        <w:spacing w:before="240" w:after="120"/>
+        <w:rPr>
+          <w:lang w:val="fr-FR"/>
+        </w:rPr>
+      </w:pPr>
+      <w:r>
+        <w:rPr>
           <w:rtl w:val="0"/>
           <w:lang w:val="fr-FR"/>
         </w:rPr>
@@ -1602,7 +2316,7 @@
       <w:tblPr>
         <w:tblW w:w="9360" w:type="dxa"/>
         <w:jc w:val="left"/>
-        <w:tblInd w:w="108" w:type="dxa"/>
+        <w:tblInd w:w="216" w:type="dxa"/>
         <w:tblBorders>
           <w:top w:val="single" w:color="ffffff" w:sz="8" w:space="0" w:shadow="0" w:frame="0"/>
           <w:left w:val="single" w:color="ffffff" w:sz="8" w:space="0" w:shadow="0" w:frame="0"/>
@@ -1625,7 +2339,7 @@
           <w:shd w:val="clear" w:color="auto" w:fill="4f81bd"/>
         </w:tblPrEx>
         <w:trPr>
-          <w:trHeight w:val="195" w:hRule="atLeast"/>
+          <w:trHeight w:val="198" w:hRule="atLeast"/>
           <w:tblHeader/>
         </w:trPr>
         <w:tc>
@@ -1653,12 +2367,6 @@
                 <w:tab w:val="left" w:pos="720"/>
                 <w:tab w:val="left" w:pos="1440"/>
               </w:tabs>
-              <w:bidi w:val="0"/>
-              <w:ind w:left="0" w:right="0" w:firstLine="0"/>
-              <w:jc w:val="left"/>
-              <w:rPr>
-                <w:rtl w:val="0"/>
-              </w:rPr>
             </w:pPr>
             <w:r>
               <w:rPr>
@@ -1709,12 +2417,6 @@
                 <w:tab w:val="left" w:pos="1440"/>
                 <w:tab w:val="left" w:pos="2160"/>
               </w:tabs>
-              <w:bidi w:val="0"/>
-              <w:ind w:left="0" w:right="0" w:firstLine="0"/>
-              <w:jc w:val="left"/>
-              <w:rPr>
-                <w:rtl w:val="0"/>
-              </w:rPr>
             </w:pPr>
             <w:r>
               <w:rPr>
@@ -1728,6 +2430,7 @@
                 <w:u w:color="ffffff"/>
                 <w:shd w:val="nil" w:color="auto" w:fill="auto"/>
                 <w:rtl w:val="0"/>
+                <w:lang w:val="en-US"/>
                 <w14:textFill>
                   <w14:solidFill>
                     <w14:srgbClr w14:val="FFFFFF"/>
@@ -1764,12 +2467,6 @@
                 <w:tab w:val="left" w:pos="1440"/>
                 <w:tab w:val="left" w:pos="2160"/>
               </w:tabs>
-              <w:bidi w:val="0"/>
-              <w:ind w:left="0" w:right="0" w:firstLine="0"/>
-              <w:jc w:val="left"/>
-              <w:rPr>
-                <w:rtl w:val="0"/>
-              </w:rPr>
             </w:pPr>
             <w:r>
               <w:rPr>
@@ -1821,12 +2518,6 @@
                 <w:tab w:val="left" w:pos="2160"/>
                 <w:tab w:val="left" w:pos="2880"/>
               </w:tabs>
-              <w:bidi w:val="0"/>
-              <w:ind w:left="0" w:right="0" w:firstLine="0"/>
-              <w:jc w:val="left"/>
-              <w:rPr>
-                <w:rtl w:val="0"/>
-              </w:rPr>
             </w:pPr>
             <w:r>
               <w:rPr>
@@ -1878,7 +2569,7 @@
           <w:shd w:val="clear" w:color="auto" w:fill="ced7e7"/>
         </w:tblPrEx>
         <w:trPr>
-          <w:trHeight w:val="594" w:hRule="atLeast"/>
+          <w:trHeight w:val="597" w:hRule="atLeast"/>
         </w:trPr>
         <w:tc>
           <w:tcPr>
@@ -1905,19 +2596,12 @@
                 <w:tab w:val="left" w:pos="720"/>
                 <w:tab w:val="left" w:pos="1440"/>
               </w:tabs>
-              <w:bidi w:val="0"/>
-              <w:ind w:left="0" w:right="0" w:firstLine="0"/>
-              <w:jc w:val="left"/>
-              <w:rPr>
-                <w:rtl w:val="0"/>
-              </w:rPr>
             </w:pPr>
             <w:r>
               <w:rPr>
                 <w:rFonts w:ascii="Times New Roman" w:hAnsi="Times New Roman"/>
                 <w:sz w:val="17"/>
                 <w:szCs w:val="17"/>
-                <w:u w:color="000000"/>
                 <w:shd w:val="nil" w:color="auto" w:fill="auto"/>
                 <w:rtl w:val="0"/>
                 <w:lang w:val="it-IT"/>
@@ -1952,16 +2636,11 @@
                 <w:tab w:val="left" w:pos="1440"/>
                 <w:tab w:val="left" w:pos="2160"/>
               </w:tabs>
-              <w:bidi w:val="0"/>
-              <w:ind w:left="0" w:right="0" w:firstLine="0"/>
-              <w:jc w:val="left"/>
               <w:rPr>
                 <w:rFonts w:ascii="Times New Roman" w:cs="Times New Roman" w:hAnsi="Times New Roman" w:eastAsia="Times New Roman"/>
                 <w:sz w:val="17"/>
                 <w:szCs w:val="17"/>
-                <w:u w:color="000000"/>
                 <w:shd w:val="nil" w:color="auto" w:fill="auto"/>
-                <w:rtl w:val="0"/>
               </w:rPr>
             </w:pPr>
             <w:r>
@@ -1969,7 +2648,6 @@
                 <w:rFonts w:ascii="Times New Roman" w:hAnsi="Times New Roman"/>
                 <w:sz w:val="17"/>
                 <w:szCs w:val="17"/>
-                <w:u w:color="000000"/>
                 <w:shd w:val="nil" w:color="auto" w:fill="auto"/>
                 <w:rtl w:val="0"/>
                 <w:lang w:val="en-US"/>
@@ -1981,13 +2659,17 @@
             <w:pPr>
               <w:pStyle w:val="Default"/>
               <w:bidi w:val="0"/>
+              <w:ind w:left="0" w:right="0" w:firstLine="0"/>
+              <w:jc w:val="left"/>
+              <w:rPr>
+                <w:rtl w:val="0"/>
+              </w:rPr>
             </w:pPr>
             <w:r>
               <w:rPr>
                 <w:rFonts w:ascii="Times New Roman" w:hAnsi="Times New Roman"/>
                 <w:sz w:val="17"/>
                 <w:szCs w:val="17"/>
-                <w:u w:color="000000"/>
                 <w:shd w:val="nil" w:color="auto" w:fill="auto"/>
                 <w:rtl w:val="0"/>
                 <w:lang w:val="fr-FR"/>
@@ -2022,19 +2704,12 @@
                 <w:tab w:val="left" w:pos="1440"/>
                 <w:tab w:val="left" w:pos="2160"/>
               </w:tabs>
-              <w:bidi w:val="0"/>
-              <w:ind w:left="0" w:right="0" w:firstLine="0"/>
-              <w:jc w:val="left"/>
-              <w:rPr>
-                <w:rtl w:val="0"/>
-              </w:rPr>
             </w:pPr>
             <w:r>
               <w:rPr>
                 <w:rFonts w:ascii="Times New Roman" w:hAnsi="Times New Roman"/>
                 <w:sz w:val="17"/>
                 <w:szCs w:val="17"/>
-                <w:u w:color="000000"/>
                 <w:shd w:val="nil" w:color="auto" w:fill="auto"/>
                 <w:rtl w:val="0"/>
                 <w:lang w:val="en-US"/>
@@ -2070,19 +2745,12 @@
                 <w:tab w:val="left" w:pos="2160"/>
                 <w:tab w:val="left" w:pos="2880"/>
               </w:tabs>
-              <w:bidi w:val="0"/>
-              <w:ind w:left="0" w:right="0" w:firstLine="0"/>
-              <w:jc w:val="left"/>
-              <w:rPr>
-                <w:rtl w:val="0"/>
-              </w:rPr>
             </w:pPr>
             <w:r>
               <w:rPr>
                 <w:rFonts w:ascii="Times New Roman" w:hAnsi="Times New Roman"/>
                 <w:sz w:val="17"/>
                 <w:szCs w:val="17"/>
-                <w:u w:color="000000"/>
                 <w:shd w:val="nil" w:color="auto" w:fill="auto"/>
                 <w:rtl w:val="0"/>
                 <w:lang w:val="de-DE"/>
@@ -2094,7 +2762,6 @@
                 <w:rFonts w:ascii="Times New Roman" w:hAnsi="Times New Roman" w:hint="default"/>
                 <w:sz w:val="17"/>
                 <w:szCs w:val="17"/>
-                <w:u w:color="000000"/>
                 <w:shd w:val="nil" w:color="auto" w:fill="auto"/>
                 <w:rtl w:val="0"/>
                 <w:lang w:val="de-DE"/>
@@ -2106,7 +2773,6 @@
                 <w:rFonts w:ascii="Times New Roman" w:hAnsi="Times New Roman"/>
                 <w:sz w:val="17"/>
                 <w:szCs w:val="17"/>
-                <w:u w:color="000000"/>
                 <w:shd w:val="nil" w:color="auto" w:fill="auto"/>
                 <w:rtl w:val="0"/>
                 <w:lang w:val="en-US"/>
@@ -2118,7 +2784,6 @@
                 <w:rFonts w:ascii="Times New Roman" w:hAnsi="Times New Roman" w:hint="default"/>
                 <w:sz w:val="17"/>
                 <w:szCs w:val="17"/>
-                <w:u w:color="000000"/>
                 <w:shd w:val="nil" w:color="auto" w:fill="auto"/>
                 <w:rtl w:val="0"/>
                 <w:lang w:val="de-DE"/>
@@ -2130,7 +2795,6 @@
                 <w:rFonts w:ascii="Times New Roman" w:hAnsi="Times New Roman"/>
                 <w:sz w:val="17"/>
                 <w:szCs w:val="17"/>
-                <w:u w:color="000000"/>
                 <w:shd w:val="nil" w:color="auto" w:fill="auto"/>
                 <w:rtl w:val="0"/>
                 <w:lang w:val="da-DK"/>
@@ -2145,7 +2809,7 @@
           <w:shd w:val="clear" w:color="auto" w:fill="ced7e7"/>
         </w:tblPrEx>
         <w:trPr>
-          <w:trHeight w:val="594" w:hRule="atLeast"/>
+          <w:trHeight w:val="597" w:hRule="atLeast"/>
         </w:trPr>
         <w:tc>
           <w:tcPr>
@@ -2172,19 +2836,12 @@
                 <w:tab w:val="left" w:pos="720"/>
                 <w:tab w:val="left" w:pos="1440"/>
               </w:tabs>
-              <w:bidi w:val="0"/>
-              <w:ind w:left="0" w:right="0" w:firstLine="0"/>
-              <w:jc w:val="left"/>
-              <w:rPr>
-                <w:rtl w:val="0"/>
-              </w:rPr>
             </w:pPr>
             <w:r>
               <w:rPr>
                 <w:rFonts w:ascii="Times New Roman" w:hAnsi="Times New Roman"/>
                 <w:sz w:val="17"/>
                 <w:szCs w:val="17"/>
-                <w:u w:color="000000"/>
                 <w:shd w:val="nil" w:color="auto" w:fill="auto"/>
                 <w:rtl w:val="0"/>
                 <w:lang w:val="it-IT"/>
@@ -2219,16 +2876,11 @@
                 <w:tab w:val="left" w:pos="1440"/>
                 <w:tab w:val="left" w:pos="2160"/>
               </w:tabs>
-              <w:bidi w:val="0"/>
-              <w:ind w:left="0" w:right="0" w:firstLine="0"/>
-              <w:jc w:val="left"/>
               <w:rPr>
                 <w:rFonts w:ascii="Times New Roman" w:cs="Times New Roman" w:hAnsi="Times New Roman" w:eastAsia="Times New Roman"/>
                 <w:sz w:val="17"/>
                 <w:szCs w:val="17"/>
-                <w:u w:color="000000"/>
                 <w:shd w:val="nil" w:color="auto" w:fill="auto"/>
-                <w:rtl w:val="0"/>
               </w:rPr>
             </w:pPr>
             <w:r>
@@ -2236,7 +2888,6 @@
                 <w:rFonts w:ascii="Times New Roman" w:hAnsi="Times New Roman"/>
                 <w:sz w:val="17"/>
                 <w:szCs w:val="17"/>
-                <w:u w:color="000000"/>
                 <w:shd w:val="nil" w:color="auto" w:fill="auto"/>
                 <w:rtl w:val="0"/>
                 <w:lang w:val="fr-FR"/>
@@ -2248,13 +2899,17 @@
             <w:pPr>
               <w:pStyle w:val="Default"/>
               <w:bidi w:val="0"/>
+              <w:ind w:left="0" w:right="0" w:firstLine="0"/>
+              <w:jc w:val="left"/>
+              <w:rPr>
+                <w:rtl w:val="0"/>
+              </w:rPr>
             </w:pPr>
             <w:r>
               <w:rPr>
                 <w:rFonts w:ascii="Times New Roman" w:hAnsi="Times New Roman"/>
                 <w:sz w:val="17"/>
                 <w:szCs w:val="17"/>
-                <w:u w:color="000000"/>
                 <w:shd w:val="nil" w:color="auto" w:fill="auto"/>
                 <w:rtl w:val="0"/>
                 <w:lang w:val="en-US"/>
@@ -2289,19 +2944,12 @@
                 <w:tab w:val="left" w:pos="1440"/>
                 <w:tab w:val="left" w:pos="2160"/>
               </w:tabs>
-              <w:bidi w:val="0"/>
-              <w:ind w:left="0" w:right="0" w:firstLine="0"/>
-              <w:jc w:val="left"/>
-              <w:rPr>
-                <w:rtl w:val="0"/>
-              </w:rPr>
             </w:pPr>
             <w:r>
               <w:rPr>
                 <w:rFonts w:ascii="Times New Roman" w:hAnsi="Times New Roman"/>
                 <w:sz w:val="17"/>
                 <w:szCs w:val="17"/>
-                <w:u w:color="000000"/>
                 <w:shd w:val="nil" w:color="auto" w:fill="auto"/>
                 <w:rtl w:val="0"/>
                 <w:lang w:val="en-US"/>
@@ -2337,19 +2985,12 @@
                 <w:tab w:val="left" w:pos="2160"/>
                 <w:tab w:val="left" w:pos="2880"/>
               </w:tabs>
-              <w:bidi w:val="0"/>
-              <w:ind w:left="0" w:right="0" w:firstLine="0"/>
-              <w:jc w:val="left"/>
-              <w:rPr>
-                <w:rtl w:val="0"/>
-              </w:rPr>
             </w:pPr>
             <w:r>
               <w:rPr>
                 <w:rFonts w:ascii="Times New Roman" w:hAnsi="Times New Roman"/>
                 <w:sz w:val="17"/>
                 <w:szCs w:val="17"/>
-                <w:u w:color="000000"/>
                 <w:shd w:val="nil" w:color="auto" w:fill="auto"/>
                 <w:rtl w:val="0"/>
                 <w:lang w:val="en-US"/>
@@ -2361,7 +3002,6 @@
                 <w:rFonts w:ascii="Times New Roman" w:hAnsi="Times New Roman" w:hint="default"/>
                 <w:sz w:val="17"/>
                 <w:szCs w:val="17"/>
-                <w:u w:color="000000"/>
                 <w:shd w:val="nil" w:color="auto" w:fill="auto"/>
                 <w:rtl w:val="0"/>
                 <w:lang w:val="de-DE"/>
@@ -2373,7 +3013,6 @@
                 <w:rFonts w:ascii="Times New Roman" w:hAnsi="Times New Roman"/>
                 <w:sz w:val="17"/>
                 <w:szCs w:val="17"/>
-                <w:u w:color="000000"/>
                 <w:shd w:val="nil" w:color="auto" w:fill="auto"/>
                 <w:rtl w:val="0"/>
                 <w:lang w:val="en-US"/>
@@ -2388,7 +3027,7 @@
           <w:shd w:val="clear" w:color="auto" w:fill="ced7e7"/>
         </w:tblPrEx>
         <w:trPr>
-          <w:trHeight w:val="594" w:hRule="atLeast"/>
+          <w:trHeight w:val="597" w:hRule="atLeast"/>
         </w:trPr>
         <w:tc>
           <w:tcPr>
@@ -2415,19 +3054,12 @@
                 <w:tab w:val="left" w:pos="720"/>
                 <w:tab w:val="left" w:pos="1440"/>
               </w:tabs>
-              <w:bidi w:val="0"/>
-              <w:ind w:left="0" w:right="0" w:firstLine="0"/>
-              <w:jc w:val="left"/>
-              <w:rPr>
-                <w:rtl w:val="0"/>
-              </w:rPr>
             </w:pPr>
             <w:r>
               <w:rPr>
                 <w:rFonts w:ascii="Times New Roman" w:hAnsi="Times New Roman"/>
                 <w:sz w:val="17"/>
                 <w:szCs w:val="17"/>
-                <w:u w:color="000000"/>
                 <w:shd w:val="nil" w:color="auto" w:fill="auto"/>
                 <w:rtl w:val="0"/>
                 <w:lang w:val="en-US"/>
@@ -2462,16 +3094,11 @@
                 <w:tab w:val="left" w:pos="1440"/>
                 <w:tab w:val="left" w:pos="2160"/>
               </w:tabs>
-              <w:bidi w:val="0"/>
-              <w:ind w:left="0" w:right="0" w:firstLine="0"/>
-              <w:jc w:val="left"/>
               <w:rPr>
                 <w:rFonts w:ascii="Times New Roman" w:cs="Times New Roman" w:hAnsi="Times New Roman" w:eastAsia="Times New Roman"/>
                 <w:sz w:val="17"/>
                 <w:szCs w:val="17"/>
-                <w:u w:color="000000"/>
                 <w:shd w:val="nil" w:color="auto" w:fill="auto"/>
-                <w:rtl w:val="0"/>
               </w:rPr>
             </w:pPr>
             <w:r>
@@ -2479,7 +3106,6 @@
                 <w:rFonts w:ascii="Times New Roman" w:hAnsi="Times New Roman"/>
                 <w:sz w:val="17"/>
                 <w:szCs w:val="17"/>
-                <w:u w:color="000000"/>
                 <w:shd w:val="nil" w:color="auto" w:fill="auto"/>
                 <w:rtl w:val="0"/>
                 <w:lang w:val="en-US"/>
@@ -2491,13 +3117,17 @@
             <w:pPr>
               <w:pStyle w:val="Default"/>
               <w:bidi w:val="0"/>
+              <w:ind w:left="0" w:right="0" w:firstLine="0"/>
+              <w:jc w:val="left"/>
+              <w:rPr>
+                <w:rtl w:val="0"/>
+              </w:rPr>
             </w:pPr>
             <w:r>
               <w:rPr>
                 <w:rFonts w:ascii="Times New Roman" w:hAnsi="Times New Roman"/>
                 <w:sz w:val="17"/>
                 <w:szCs w:val="17"/>
-                <w:u w:color="000000"/>
                 <w:shd w:val="nil" w:color="auto" w:fill="auto"/>
                 <w:rtl w:val="0"/>
                 <w:lang w:val="en-US"/>
@@ -2532,19 +3162,12 @@
                 <w:tab w:val="left" w:pos="1440"/>
                 <w:tab w:val="left" w:pos="2160"/>
               </w:tabs>
-              <w:bidi w:val="0"/>
-              <w:ind w:left="0" w:right="0" w:firstLine="0"/>
-              <w:jc w:val="left"/>
-              <w:rPr>
-                <w:rtl w:val="0"/>
-              </w:rPr>
             </w:pPr>
             <w:r>
               <w:rPr>
                 <w:rFonts w:ascii="Times New Roman" w:hAnsi="Times New Roman"/>
                 <w:sz w:val="17"/>
                 <w:szCs w:val="17"/>
-                <w:u w:color="000000"/>
                 <w:shd w:val="nil" w:color="auto" w:fill="auto"/>
                 <w:rtl w:val="0"/>
                 <w:lang w:val="en-US"/>
@@ -2580,19 +3203,12 @@
                 <w:tab w:val="left" w:pos="2160"/>
                 <w:tab w:val="left" w:pos="2880"/>
               </w:tabs>
-              <w:bidi w:val="0"/>
-              <w:ind w:left="0" w:right="0" w:firstLine="0"/>
-              <w:jc w:val="left"/>
-              <w:rPr>
-                <w:rtl w:val="0"/>
-              </w:rPr>
             </w:pPr>
             <w:r>
               <w:rPr>
                 <w:rFonts w:ascii="Times New Roman" w:hAnsi="Times New Roman"/>
                 <w:sz w:val="17"/>
                 <w:szCs w:val="17"/>
-                <w:u w:color="000000"/>
                 <w:shd w:val="nil" w:color="auto" w:fill="auto"/>
                 <w:rtl w:val="0"/>
                 <w:lang w:val="en-US"/>
@@ -2604,7 +3220,6 @@
                 <w:rFonts w:ascii="Times New Roman" w:hAnsi="Times New Roman" w:hint="default"/>
                 <w:sz w:val="17"/>
                 <w:szCs w:val="17"/>
-                <w:u w:color="000000"/>
                 <w:shd w:val="nil" w:color="auto" w:fill="auto"/>
                 <w:rtl w:val="0"/>
                 <w:lang w:val="de-DE"/>
@@ -2616,7 +3231,6 @@
                 <w:rFonts w:ascii="Times New Roman" w:hAnsi="Times New Roman"/>
                 <w:sz w:val="17"/>
                 <w:szCs w:val="17"/>
-                <w:u w:color="000000"/>
                 <w:shd w:val="nil" w:color="auto" w:fill="auto"/>
                 <w:rtl w:val="0"/>
                 <w:lang w:val="de-DE"/>
@@ -2628,7 +3242,6 @@
                 <w:rFonts w:ascii="Times New Roman" w:hAnsi="Times New Roman" w:hint="default"/>
                 <w:sz w:val="17"/>
                 <w:szCs w:val="17"/>
-                <w:u w:color="000000"/>
                 <w:shd w:val="nil" w:color="auto" w:fill="auto"/>
                 <w:rtl w:val="0"/>
                 <w:lang w:val="de-DE"/>
@@ -2640,7 +3253,6 @@
                 <w:rFonts w:ascii="Times New Roman" w:hAnsi="Times New Roman"/>
                 <w:sz w:val="17"/>
                 <w:szCs w:val="17"/>
-                <w:u w:color="000000"/>
                 <w:shd w:val="nil" w:color="auto" w:fill="auto"/>
                 <w:rtl w:val="0"/>
                 <w:lang w:val="pt-PT"/>
@@ -2655,7 +3267,7 @@
           <w:shd w:val="clear" w:color="auto" w:fill="ced7e7"/>
         </w:tblPrEx>
         <w:trPr>
-          <w:trHeight w:val="992" w:hRule="atLeast"/>
+          <w:trHeight w:val="994" w:hRule="atLeast"/>
         </w:trPr>
         <w:tc>
           <w:tcPr>
@@ -2682,21 +3294,15 @@
                 <w:tab w:val="left" w:pos="720"/>
                 <w:tab w:val="left" w:pos="1440"/>
               </w:tabs>
-              <w:bidi w:val="0"/>
-              <w:ind w:left="0" w:right="0" w:firstLine="0"/>
-              <w:jc w:val="left"/>
-              <w:rPr>
-                <w:rtl w:val="0"/>
-              </w:rPr>
             </w:pPr>
             <w:r>
               <w:rPr>
                 <w:rFonts w:ascii="Times New Roman" w:hAnsi="Times New Roman"/>
                 <w:sz w:val="17"/>
                 <w:szCs w:val="17"/>
-                <w:u w:color="000000"/>
                 <w:shd w:val="nil" w:color="auto" w:fill="auto"/>
                 <w:rtl w:val="0"/>
+                <w:lang w:val="en-US"/>
               </w:rPr>
               <w:t>IV. AR / AP / Client</w:t>
             </w:r>
@@ -2728,16 +3334,11 @@
                 <w:tab w:val="left" w:pos="1440"/>
                 <w:tab w:val="left" w:pos="2160"/>
               </w:tabs>
-              <w:bidi w:val="0"/>
-              <w:ind w:left="0" w:right="0" w:firstLine="0"/>
-              <w:jc w:val="left"/>
               <w:rPr>
                 <w:rFonts w:ascii="Times New Roman" w:cs="Times New Roman" w:hAnsi="Times New Roman" w:eastAsia="Times New Roman"/>
                 <w:sz w:val="17"/>
                 <w:szCs w:val="17"/>
-                <w:u w:color="000000"/>
                 <w:shd w:val="nil" w:color="auto" w:fill="auto"/>
-                <w:rtl w:val="0"/>
               </w:rPr>
             </w:pPr>
             <w:r>
@@ -2745,7 +3346,6 @@
                 <w:rFonts w:ascii="Times New Roman" w:hAnsi="Times New Roman"/>
                 <w:sz w:val="17"/>
                 <w:szCs w:val="17"/>
-                <w:u w:color="000000"/>
                 <w:shd w:val="nil" w:color="auto" w:fill="auto"/>
                 <w:rtl w:val="0"/>
                 <w:lang w:val="de-DE"/>
@@ -2757,11 +3357,12 @@
             <w:pPr>
               <w:pStyle w:val="Default"/>
               <w:bidi w:val="0"/>
+              <w:ind w:left="0" w:right="0" w:firstLine="0"/>
+              <w:jc w:val="left"/>
               <w:rPr>
                 <w:rFonts w:ascii="Times New Roman" w:cs="Times New Roman" w:hAnsi="Times New Roman" w:eastAsia="Times New Roman"/>
                 <w:sz w:val="17"/>
                 <w:szCs w:val="17"/>
-                <w:u w:color="000000"/>
                 <w:shd w:val="nil" w:color="auto" w:fill="auto"/>
                 <w:rtl w:val="0"/>
               </w:rPr>
@@ -2771,7 +3372,6 @@
                 <w:rFonts w:ascii="Times New Roman" w:hAnsi="Times New Roman"/>
                 <w:sz w:val="17"/>
                 <w:szCs w:val="17"/>
-                <w:u w:color="000000"/>
                 <w:shd w:val="nil" w:color="auto" w:fill="auto"/>
                 <w:rtl w:val="0"/>
                 <w:lang w:val="es-ES_tradnl"/>
@@ -2783,13 +3383,17 @@
             <w:pPr>
               <w:pStyle w:val="Default"/>
               <w:bidi w:val="0"/>
+              <w:ind w:left="0" w:right="0" w:firstLine="0"/>
+              <w:jc w:val="left"/>
+              <w:rPr>
+                <w:rtl w:val="0"/>
+              </w:rPr>
             </w:pPr>
             <w:r>
               <w:rPr>
                 <w:rFonts w:ascii="Times New Roman" w:hAnsi="Times New Roman"/>
                 <w:sz w:val="17"/>
                 <w:szCs w:val="17"/>
-                <w:u w:color="000000"/>
                 <w:shd w:val="nil" w:color="auto" w:fill="auto"/>
                 <w:rtl w:val="0"/>
                 <w:lang w:val="en-US"/>
@@ -2824,19 +3428,12 @@
                 <w:tab w:val="left" w:pos="1440"/>
                 <w:tab w:val="left" w:pos="2160"/>
               </w:tabs>
-              <w:bidi w:val="0"/>
-              <w:ind w:left="0" w:right="0" w:firstLine="0"/>
-              <w:jc w:val="left"/>
-              <w:rPr>
-                <w:rtl w:val="0"/>
-              </w:rPr>
             </w:pPr>
             <w:r>
               <w:rPr>
                 <w:rFonts w:ascii="Times New Roman" w:hAnsi="Times New Roman"/>
                 <w:sz w:val="17"/>
                 <w:szCs w:val="17"/>
-                <w:u w:color="000000"/>
                 <w:shd w:val="nil" w:color="auto" w:fill="auto"/>
                 <w:rtl w:val="0"/>
                 <w:lang w:val="en-US"/>
@@ -2872,19 +3469,12 @@
                 <w:tab w:val="left" w:pos="2160"/>
                 <w:tab w:val="left" w:pos="2880"/>
               </w:tabs>
-              <w:bidi w:val="0"/>
-              <w:ind w:left="0" w:right="0" w:firstLine="0"/>
-              <w:jc w:val="left"/>
-              <w:rPr>
-                <w:rtl w:val="0"/>
-              </w:rPr>
             </w:pPr>
             <w:r>
               <w:rPr>
                 <w:rFonts w:ascii="Times New Roman" w:hAnsi="Times New Roman"/>
                 <w:sz w:val="17"/>
                 <w:szCs w:val="17"/>
-                <w:u w:color="000000"/>
                 <w:shd w:val="nil" w:color="auto" w:fill="auto"/>
                 <w:rtl w:val="0"/>
                 <w:lang w:val="en-US"/>
@@ -2896,7 +3486,6 @@
                 <w:rFonts w:ascii="Times New Roman" w:hAnsi="Times New Roman" w:hint="default"/>
                 <w:sz w:val="17"/>
                 <w:szCs w:val="17"/>
-                <w:u w:color="000000"/>
                 <w:shd w:val="nil" w:color="auto" w:fill="auto"/>
                 <w:rtl w:val="0"/>
                 <w:lang w:val="de-DE"/>
@@ -2908,7 +3497,6 @@
                 <w:rFonts w:ascii="Times New Roman" w:hAnsi="Times New Roman"/>
                 <w:sz w:val="17"/>
                 <w:szCs w:val="17"/>
-                <w:u w:color="000000"/>
                 <w:shd w:val="nil" w:color="auto" w:fill="auto"/>
                 <w:rtl w:val="0"/>
                 <w:lang w:val="de-DE"/>
@@ -2920,7 +3508,6 @@
                 <w:rFonts w:ascii="Times New Roman" w:hAnsi="Times New Roman" w:hint="default"/>
                 <w:sz w:val="17"/>
                 <w:szCs w:val="17"/>
-                <w:u w:color="000000"/>
                 <w:shd w:val="nil" w:color="auto" w:fill="auto"/>
                 <w:rtl w:val="0"/>
                 <w:lang w:val="de-DE"/>
@@ -2932,7 +3519,6 @@
                 <w:rFonts w:ascii="Times New Roman" w:hAnsi="Times New Roman"/>
                 <w:sz w:val="17"/>
                 <w:szCs w:val="17"/>
-                <w:u w:color="000000"/>
                 <w:shd w:val="nil" w:color="auto" w:fill="auto"/>
                 <w:rtl w:val="0"/>
                 <w:lang w:val="pt-PT"/>
@@ -2947,7 +3533,7 @@
           <w:shd w:val="clear" w:color="auto" w:fill="ced7e7"/>
         </w:tblPrEx>
         <w:trPr>
-          <w:trHeight w:val="594" w:hRule="atLeast"/>
+          <w:trHeight w:val="597" w:hRule="atLeast"/>
         </w:trPr>
         <w:tc>
           <w:tcPr>
@@ -2974,19 +3560,12 @@
                 <w:tab w:val="left" w:pos="720"/>
                 <w:tab w:val="left" w:pos="1440"/>
               </w:tabs>
-              <w:bidi w:val="0"/>
-              <w:ind w:left="0" w:right="0" w:firstLine="0"/>
-              <w:jc w:val="left"/>
-              <w:rPr>
-                <w:rtl w:val="0"/>
-              </w:rPr>
             </w:pPr>
             <w:r>
               <w:rPr>
                 <w:rFonts w:ascii="Times New Roman" w:hAnsi="Times New Roman"/>
                 <w:sz w:val="17"/>
                 <w:szCs w:val="17"/>
-                <w:u w:color="000000"/>
                 <w:shd w:val="nil" w:color="auto" w:fill="auto"/>
                 <w:rtl w:val="0"/>
                 <w:lang w:val="it-IT"/>
@@ -3021,16 +3600,11 @@
                 <w:tab w:val="left" w:pos="1440"/>
                 <w:tab w:val="left" w:pos="2160"/>
               </w:tabs>
-              <w:bidi w:val="0"/>
-              <w:ind w:left="0" w:right="0" w:firstLine="0"/>
-              <w:jc w:val="left"/>
               <w:rPr>
                 <w:rFonts w:ascii="Times New Roman" w:cs="Times New Roman" w:hAnsi="Times New Roman" w:eastAsia="Times New Roman"/>
                 <w:sz w:val="17"/>
                 <w:szCs w:val="17"/>
-                <w:u w:color="000000"/>
                 <w:shd w:val="nil" w:color="auto" w:fill="auto"/>
-                <w:rtl w:val="0"/>
               </w:rPr>
             </w:pPr>
             <w:r>
@@ -3038,7 +3612,6 @@
                 <w:rFonts w:ascii="Times New Roman" w:hAnsi="Times New Roman"/>
                 <w:sz w:val="17"/>
                 <w:szCs w:val="17"/>
-                <w:u w:color="000000"/>
                 <w:shd w:val="nil" w:color="auto" w:fill="auto"/>
                 <w:rtl w:val="0"/>
                 <w:lang w:val="it-IT"/>
@@ -3050,13 +3623,17 @@
             <w:pPr>
               <w:pStyle w:val="Default"/>
               <w:bidi w:val="0"/>
+              <w:ind w:left="0" w:right="0" w:firstLine="0"/>
+              <w:jc w:val="left"/>
+              <w:rPr>
+                <w:rtl w:val="0"/>
+              </w:rPr>
             </w:pPr>
             <w:r>
               <w:rPr>
                 <w:rFonts w:ascii="Times New Roman" w:hAnsi="Times New Roman"/>
                 <w:sz w:val="17"/>
                 <w:szCs w:val="17"/>
-                <w:u w:color="000000"/>
                 <w:shd w:val="nil" w:color="auto" w:fill="auto"/>
                 <w:rtl w:val="0"/>
                 <w:lang w:val="en-US"/>
@@ -3091,19 +3668,12 @@
                 <w:tab w:val="left" w:pos="1440"/>
                 <w:tab w:val="left" w:pos="2160"/>
               </w:tabs>
-              <w:bidi w:val="0"/>
-              <w:ind w:left="0" w:right="0" w:firstLine="0"/>
-              <w:jc w:val="left"/>
-              <w:rPr>
-                <w:rtl w:val="0"/>
-              </w:rPr>
             </w:pPr>
             <w:r>
               <w:rPr>
                 <w:rFonts w:ascii="Times New Roman" w:hAnsi="Times New Roman"/>
                 <w:sz w:val="17"/>
                 <w:szCs w:val="17"/>
-                <w:u w:color="000000"/>
                 <w:shd w:val="nil" w:color="auto" w:fill="auto"/>
                 <w:rtl w:val="0"/>
                 <w:lang w:val="en-US"/>
@@ -3139,19 +3709,12 @@
                 <w:tab w:val="left" w:pos="2160"/>
                 <w:tab w:val="left" w:pos="2880"/>
               </w:tabs>
-              <w:bidi w:val="0"/>
-              <w:ind w:left="0" w:right="0" w:firstLine="0"/>
-              <w:jc w:val="left"/>
-              <w:rPr>
-                <w:rtl w:val="0"/>
-              </w:rPr>
             </w:pPr>
             <w:r>
               <w:rPr>
                 <w:rFonts w:ascii="Times New Roman" w:hAnsi="Times New Roman"/>
                 <w:sz w:val="17"/>
                 <w:szCs w:val="17"/>
-                <w:u w:color="000000"/>
                 <w:shd w:val="nil" w:color="auto" w:fill="auto"/>
                 <w:rtl w:val="0"/>
                 <w:lang w:val="en-US"/>
@@ -3163,7 +3726,6 @@
                 <w:rFonts w:ascii="Times New Roman" w:hAnsi="Times New Roman" w:hint="default"/>
                 <w:sz w:val="17"/>
                 <w:szCs w:val="17"/>
-                <w:u w:color="000000"/>
                 <w:shd w:val="nil" w:color="auto" w:fill="auto"/>
                 <w:rtl w:val="0"/>
                 <w:lang w:val="de-DE"/>
@@ -3175,7 +3737,6 @@
                 <w:rFonts w:ascii="Times New Roman" w:hAnsi="Times New Roman"/>
                 <w:sz w:val="17"/>
                 <w:szCs w:val="17"/>
-                <w:u w:color="000000"/>
                 <w:shd w:val="nil" w:color="auto" w:fill="auto"/>
                 <w:rtl w:val="0"/>
                 <w:lang w:val="en-US"/>
@@ -3190,7 +3751,7 @@
           <w:shd w:val="clear" w:color="auto" w:fill="ced7e7"/>
         </w:tblPrEx>
         <w:trPr>
-          <w:trHeight w:val="594" w:hRule="atLeast"/>
+          <w:trHeight w:val="597" w:hRule="atLeast"/>
         </w:trPr>
         <w:tc>
           <w:tcPr>
@@ -3217,21 +3778,15 @@
                 <w:tab w:val="left" w:pos="720"/>
                 <w:tab w:val="left" w:pos="1440"/>
               </w:tabs>
-              <w:bidi w:val="0"/>
-              <w:ind w:left="0" w:right="0" w:firstLine="0"/>
-              <w:jc w:val="left"/>
-              <w:rPr>
-                <w:rtl w:val="0"/>
-              </w:rPr>
             </w:pPr>
             <w:r>
               <w:rPr>
                 <w:rFonts w:ascii="Times New Roman" w:hAnsi="Times New Roman"/>
                 <w:sz w:val="17"/>
                 <w:szCs w:val="17"/>
-                <w:u w:color="000000"/>
                 <w:shd w:val="nil" w:color="auto" w:fill="auto"/>
                 <w:rtl w:val="0"/>
+                <w:lang w:val="en-US"/>
               </w:rPr>
               <w:t>VI. HITL</w:t>
             </w:r>
@@ -3263,16 +3818,11 @@
                 <w:tab w:val="left" w:pos="1440"/>
                 <w:tab w:val="left" w:pos="2160"/>
               </w:tabs>
-              <w:bidi w:val="0"/>
-              <w:ind w:left="0" w:right="0" w:firstLine="0"/>
-              <w:jc w:val="left"/>
               <w:rPr>
                 <w:rFonts w:ascii="Times New Roman" w:cs="Times New Roman" w:hAnsi="Times New Roman" w:eastAsia="Times New Roman"/>
                 <w:sz w:val="17"/>
                 <w:szCs w:val="17"/>
-                <w:u w:color="000000"/>
                 <w:shd w:val="nil" w:color="auto" w:fill="auto"/>
-                <w:rtl w:val="0"/>
               </w:rPr>
             </w:pPr>
             <w:r>
@@ -3280,7 +3830,6 @@
                 <w:rFonts w:ascii="Times New Roman" w:hAnsi="Times New Roman"/>
                 <w:sz w:val="17"/>
                 <w:szCs w:val="17"/>
-                <w:u w:color="000000"/>
                 <w:shd w:val="nil" w:color="auto" w:fill="auto"/>
                 <w:rtl w:val="0"/>
                 <w:lang w:val="fr-FR"/>
@@ -3292,13 +3841,17 @@
             <w:pPr>
               <w:pStyle w:val="Default"/>
               <w:bidi w:val="0"/>
+              <w:ind w:left="0" w:right="0" w:firstLine="0"/>
+              <w:jc w:val="left"/>
+              <w:rPr>
+                <w:rtl w:val="0"/>
+              </w:rPr>
             </w:pPr>
             <w:r>
               <w:rPr>
                 <w:rFonts w:ascii="Times New Roman" w:hAnsi="Times New Roman"/>
                 <w:sz w:val="17"/>
                 <w:szCs w:val="17"/>
-                <w:u w:color="000000"/>
                 <w:shd w:val="nil" w:color="auto" w:fill="auto"/>
                 <w:rtl w:val="0"/>
                 <w:lang w:val="en-US"/>
@@ -3333,19 +3886,12 @@
                 <w:tab w:val="left" w:pos="1440"/>
                 <w:tab w:val="left" w:pos="2160"/>
               </w:tabs>
-              <w:bidi w:val="0"/>
-              <w:ind w:left="0" w:right="0" w:firstLine="0"/>
-              <w:jc w:val="left"/>
-              <w:rPr>
-                <w:rtl w:val="0"/>
-              </w:rPr>
             </w:pPr>
             <w:r>
               <w:rPr>
                 <w:rFonts w:ascii="Times New Roman" w:hAnsi="Times New Roman"/>
                 <w:sz w:val="17"/>
                 <w:szCs w:val="17"/>
-                <w:u w:color="000000"/>
                 <w:shd w:val="nil" w:color="auto" w:fill="auto"/>
                 <w:rtl w:val="0"/>
                 <w:lang w:val="en-US"/>
@@ -3381,19 +3927,12 @@
                 <w:tab w:val="left" w:pos="2160"/>
                 <w:tab w:val="left" w:pos="2880"/>
               </w:tabs>
-              <w:bidi w:val="0"/>
-              <w:ind w:left="0" w:right="0" w:firstLine="0"/>
-              <w:jc w:val="left"/>
-              <w:rPr>
-                <w:rtl w:val="0"/>
-              </w:rPr>
             </w:pPr>
             <w:r>
               <w:rPr>
                 <w:rFonts w:ascii="Times New Roman" w:hAnsi="Times New Roman"/>
                 <w:sz w:val="17"/>
                 <w:szCs w:val="17"/>
-                <w:u w:color="000000"/>
                 <w:shd w:val="nil" w:color="auto" w:fill="auto"/>
                 <w:rtl w:val="0"/>
                 <w:lang w:val="de-DE"/>
@@ -3405,7 +3944,6 @@
                 <w:rFonts w:ascii="Times New Roman" w:hAnsi="Times New Roman" w:hint="default"/>
                 <w:sz w:val="17"/>
                 <w:szCs w:val="17"/>
-                <w:u w:color="000000"/>
                 <w:shd w:val="nil" w:color="auto" w:fill="auto"/>
                 <w:rtl w:val="0"/>
                 <w:lang w:val="de-DE"/>
@@ -3417,7 +3955,6 @@
                 <w:rFonts w:ascii="Times New Roman" w:hAnsi="Times New Roman"/>
                 <w:sz w:val="17"/>
                 <w:szCs w:val="17"/>
-                <w:u w:color="000000"/>
                 <w:shd w:val="nil" w:color="auto" w:fill="auto"/>
                 <w:rtl w:val="0"/>
                 <w:lang w:val="en-US"/>
@@ -3429,7 +3966,6 @@
                 <w:rFonts w:ascii="Times New Roman" w:hAnsi="Times New Roman" w:hint="default"/>
                 <w:sz w:val="17"/>
                 <w:szCs w:val="17"/>
-                <w:u w:color="000000"/>
                 <w:shd w:val="nil" w:color="auto" w:fill="auto"/>
                 <w:rtl w:val="0"/>
                 <w:lang w:val="de-DE"/>
@@ -3441,7 +3977,6 @@
                 <w:rFonts w:ascii="Times New Roman" w:hAnsi="Times New Roman"/>
                 <w:sz w:val="17"/>
                 <w:szCs w:val="17"/>
-                <w:u w:color="000000"/>
                 <w:shd w:val="nil" w:color="auto" w:fill="auto"/>
                 <w:rtl w:val="0"/>
                 <w:lang w:val="en-US"/>
@@ -3457,6 +3992,10 @@
         <w:pStyle w:val="Heading 2"/>
         <w:widowControl w:val="0"/>
         <w:spacing w:before="240" w:after="120"/>
+        <w:ind w:left="108" w:hanging="108"/>
+        <w:rPr>
+          <w:lang w:val="fr-FR"/>
+        </w:rPr>
       </w:pPr>
     </w:p>
     <w:p>
@@ -3465,6 +4004,13 @@
         <w:widowControl w:val="0"/>
         <w:spacing w:before="240" w:after="120"/>
       </w:pPr>
+    </w:p>
+    <w:p>
+      <w:pPr>
+        <w:pStyle w:val="Heading 2"/>
+        <w:widowControl w:val="0"/>
+        <w:spacing w:before="240" w:after="120"/>
+      </w:pPr>
       <w:r>
         <w:rPr>
           <w:b w:val="0"/>
@@ -3595,7 +4141,26 @@
             </w14:solidFill>
           </w14:textFill>
         </w:rPr>
-        <w:t xml:space="preserve"> — the progressive corruption of context that occurs when agents communicate through natural language message histories. The SharedState fields are partitioned into two categories:</w:t>
+        <w:t xml:space="preserve"> — </w:t>
+      </w:r>
+      <w:r>
+        <w:rPr>
+          <w:b w:val="0"/>
+          <w:bCs w:val="0"/>
+          <w:outline w:val="0"/>
+          <w:color w:val="000000"/>
+          <w:sz w:val="20"/>
+          <w:szCs w:val="20"/>
+          <w:u w:color="000000"/>
+          <w:rtl w:val="0"/>
+          <w:lang w:val="en-US"/>
+          <w14:textFill>
+            <w14:solidFill>
+              <w14:srgbClr w14:val="000000"/>
+            </w14:solidFill>
+          </w14:textFill>
+        </w:rPr>
+        <w:t>the progressive corruption of context that occurs when agents communicate through natural language message histories. The SharedState fields are partitioned into two categories:</w:t>
       </w:r>
     </w:p>
     <w:p>
@@ -3605,8 +4170,12 @@
           <w:ilvl w:val="0"/>
           <w:numId w:val="2"/>
         </w:numPr>
+        <w:bidi w:val="0"/>
         <w:spacing w:after="80"/>
-        <w:rPr>
+        <w:ind w:right="0"/>
+        <w:jc w:val="left"/>
+        <w:rPr>
+          <w:rtl w:val="0"/>
           <w:lang w:val="en-US"/>
         </w:rPr>
       </w:pPr>
@@ -3633,8 +4202,12 @@
           <w:ilvl w:val="0"/>
           <w:numId w:val="2"/>
         </w:numPr>
+        <w:bidi w:val="0"/>
         <w:spacing w:after="80"/>
-        <w:rPr>
+        <w:ind w:right="0"/>
+        <w:jc w:val="left"/>
+        <w:rPr>
+          <w:rtl w:val="0"/>
           <w:lang w:val="en-US"/>
         </w:rPr>
       </w:pPr>
@@ -3672,7 +4245,67 @@
             </w14:solidFill>
           </w14:textFill>
         </w:rPr>
-        <w:t>Each agent node returns only a delta — the subset of fields it modifies — which LangGraph automatically merges into the global state. This ensures agents remain decoupled and that state evolution is auditable.</w:t>
+        <w:t xml:space="preserve">Each agent node returns only a delta </w:t>
+      </w:r>
+      <w:r>
+        <w:rPr>
+          <w:outline w:val="0"/>
+          <w:color w:val="000000"/>
+          <w:u w:color="000000"/>
+          <w:rtl w:val="0"/>
+          <w:lang w:val="en-US"/>
+          <w14:textFill>
+            <w14:solidFill>
+              <w14:srgbClr w14:val="000000"/>
+            </w14:solidFill>
+          </w14:textFill>
+        </w:rPr>
+        <w:t xml:space="preserve">— </w:t>
+      </w:r>
+      <w:r>
+        <w:rPr>
+          <w:outline w:val="0"/>
+          <w:color w:val="000000"/>
+          <w:u w:color="000000"/>
+          <w:rtl w:val="0"/>
+          <w:lang w:val="en-US"/>
+          <w14:textFill>
+            <w14:solidFill>
+              <w14:srgbClr w14:val="000000"/>
+            </w14:solidFill>
+          </w14:textFill>
+        </w:rPr>
+        <w:t xml:space="preserve">the subset of fields it modifies </w:t>
+      </w:r>
+      <w:r>
+        <w:rPr>
+          <w:outline w:val="0"/>
+          <w:color w:val="000000"/>
+          <w:u w:color="000000"/>
+          <w:rtl w:val="0"/>
+          <w:lang w:val="en-US"/>
+          <w14:textFill>
+            <w14:solidFill>
+              <w14:srgbClr w14:val="000000"/>
+            </w14:solidFill>
+          </w14:textFill>
+        </w:rPr>
+        <w:t xml:space="preserve">— </w:t>
+      </w:r>
+      <w:r>
+        <w:rPr>
+          <w:outline w:val="0"/>
+          <w:color w:val="000000"/>
+          <w:u w:color="000000"/>
+          <w:rtl w:val="0"/>
+          <w:lang w:val="en-US"/>
+          <w14:textFill>
+            <w14:solidFill>
+              <w14:srgbClr w14:val="000000"/>
+            </w14:solidFill>
+          </w14:textFill>
+        </w:rPr>
+        <w:t>which LangGraph automatically merges into the global state. This ensures agents remain decoupled and that state evolution is auditable.</w:t>
       </w:r>
     </w:p>
     <w:p>
@@ -3682,6 +4315,22 @@
       </w:pPr>
       <w:r>
         <w:rPr>
+          <w:rFonts w:ascii="Arial Unicode MS" w:cs="Arial Unicode MS" w:hAnsi="Arial Unicode MS" w:eastAsia="Arial Unicode MS"/>
+          <w:b w:val="0"/>
+          <w:bCs w:val="0"/>
+          <w:i w:val="0"/>
+          <w:iCs w:val="0"/>
+        </w:rPr>
+        <w:br w:type="page"/>
+      </w:r>
+    </w:p>
+    <w:p>
+      <w:pPr>
+        <w:pStyle w:val="Heading"/>
+        <w:spacing w:before="240"/>
+      </w:pPr>
+      <w:r>
+        <w:rPr>
           <w:rtl w:val="0"/>
           <w:lang w:val="fr-FR"/>
         </w:rPr>
@@ -3696,6 +4345,7 @@
       <w:r>
         <w:rPr>
           <w:rtl w:val="0"/>
+          <w:lang w:val="en-US"/>
         </w:rPr>
         <w:t>4.1 Motivation</w:t>
       </w:r>
@@ -3722,7 +4372,83 @@
             </w14:solidFill>
           </w14:textFill>
         </w:rPr>
-        <w:t>Accounting operations carry fiduciary and legal obligations that preclude fully autonomous execution of high-stakes actions — client escalations, reconciliation corrections, vendor payment approvals, new client onboarding — without human oversight. However, a HITL mechanism requiring a supervising accountant to monitor a console is impractical: accounting professionals are frequently in client meetings, on-site visits, or otherwise away from a workstation.</w:t>
+        <w:t xml:space="preserve">Accounting operations carry fiduciary and legal obligations that preclude fully autonomous execution of high-stakes actions </w:t>
+      </w:r>
+      <w:r>
+        <w:rPr>
+          <w:b w:val="0"/>
+          <w:bCs w:val="0"/>
+          <w:outline w:val="0"/>
+          <w:color w:val="000000"/>
+          <w:sz w:val="20"/>
+          <w:szCs w:val="20"/>
+          <w:u w:color="000000"/>
+          <w:rtl w:val="0"/>
+          <w:lang w:val="en-US"/>
+          <w14:textFill>
+            <w14:solidFill>
+              <w14:srgbClr w14:val="000000"/>
+            </w14:solidFill>
+          </w14:textFill>
+        </w:rPr>
+        <w:t xml:space="preserve">— </w:t>
+      </w:r>
+      <w:r>
+        <w:rPr>
+          <w:b w:val="0"/>
+          <w:bCs w:val="0"/>
+          <w:outline w:val="0"/>
+          <w:color w:val="000000"/>
+          <w:sz w:val="20"/>
+          <w:szCs w:val="20"/>
+          <w:u w:color="000000"/>
+          <w:rtl w:val="0"/>
+          <w:lang w:val="en-US"/>
+          <w14:textFill>
+            <w14:solidFill>
+              <w14:srgbClr w14:val="000000"/>
+            </w14:solidFill>
+          </w14:textFill>
+        </w:rPr>
+        <w:t xml:space="preserve">client escalations, reconciliation corrections, vendor payment approvals, new client onboarding </w:t>
+      </w:r>
+      <w:r>
+        <w:rPr>
+          <w:b w:val="0"/>
+          <w:bCs w:val="0"/>
+          <w:outline w:val="0"/>
+          <w:color w:val="000000"/>
+          <w:sz w:val="20"/>
+          <w:szCs w:val="20"/>
+          <w:u w:color="000000"/>
+          <w:rtl w:val="0"/>
+          <w:lang w:val="en-US"/>
+          <w14:textFill>
+            <w14:solidFill>
+              <w14:srgbClr w14:val="000000"/>
+            </w14:solidFill>
+          </w14:textFill>
+        </w:rPr>
+        <w:t xml:space="preserve">— </w:t>
+      </w:r>
+      <w:r>
+        <w:rPr>
+          <w:b w:val="0"/>
+          <w:bCs w:val="0"/>
+          <w:outline w:val="0"/>
+          <w:color w:val="000000"/>
+          <w:sz w:val="20"/>
+          <w:szCs w:val="20"/>
+          <w:u w:color="000000"/>
+          <w:rtl w:val="0"/>
+          <w:lang w:val="en-US"/>
+          <w14:textFill>
+            <w14:solidFill>
+              <w14:srgbClr w14:val="000000"/>
+            </w14:solidFill>
+          </w14:textFill>
+        </w:rPr>
+        <w:t>without human oversight. However, a HITL mechanism requiring a supervising accountant to monitor a console is impractical: accounting professionals are frequently in client meetings, on-site visits, or otherwise away from a workstation.</w:t>
       </w:r>
     </w:p>
     <w:p>
@@ -3767,7 +4493,7 @@
       <w:tblPr>
         <w:tblW w:w="9360" w:type="dxa"/>
         <w:jc w:val="left"/>
-        <w:tblInd w:w="108" w:type="dxa"/>
+        <w:tblInd w:w="216" w:type="dxa"/>
         <w:tblBorders>
           <w:top w:val="single" w:color="ffffff" w:sz="8" w:space="0" w:shadow="0" w:frame="0"/>
           <w:left w:val="single" w:color="ffffff" w:sz="8" w:space="0" w:shadow="0" w:frame="0"/>
@@ -3790,7 +4516,7 @@
           <w:shd w:val="clear" w:color="auto" w:fill="4f81bd"/>
         </w:tblPrEx>
         <w:trPr>
-          <w:trHeight w:val="195" w:hRule="atLeast"/>
+          <w:trHeight w:val="198" w:hRule="atLeast"/>
           <w:tblHeader/>
         </w:trPr>
         <w:tc>
@@ -3817,12 +4543,6 @@
               <w:tabs>
                 <w:tab w:val="left" w:pos="720"/>
               </w:tabs>
-              <w:bidi w:val="0"/>
-              <w:ind w:left="0" w:right="0" w:firstLine="0"/>
-              <w:jc w:val="left"/>
-              <w:rPr>
-                <w:rtl w:val="0"/>
-              </w:rPr>
             </w:pPr>
             <w:r>
               <w:rPr>
@@ -3872,12 +4592,6 @@
                 <w:tab w:val="left" w:pos="720"/>
                 <w:tab w:val="left" w:pos="1440"/>
               </w:tabs>
-              <w:bidi w:val="0"/>
-              <w:ind w:left="0" w:right="0" w:firstLine="0"/>
-              <w:jc w:val="left"/>
-              <w:rPr>
-                <w:rtl w:val="0"/>
-              </w:rPr>
             </w:pPr>
             <w:r>
               <w:rPr>
@@ -3891,6 +4605,7 @@
                 <w:u w:color="ffffff"/>
                 <w:shd w:val="nil" w:color="auto" w:fill="auto"/>
                 <w:rtl w:val="0"/>
+                <w:lang w:val="en-US"/>
                 <w14:textFill>
                   <w14:solidFill>
                     <w14:srgbClr w14:val="FFFFFF"/>
@@ -3928,12 +4643,6 @@
                 <w:tab w:val="left" w:pos="2160"/>
                 <w:tab w:val="left" w:pos="2880"/>
               </w:tabs>
-              <w:bidi w:val="0"/>
-              <w:ind w:left="0" w:right="0" w:firstLine="0"/>
-              <w:jc w:val="left"/>
-              <w:rPr>
-                <w:rtl w:val="0"/>
-              </w:rPr>
             </w:pPr>
             <w:r>
               <w:rPr>
@@ -3947,6 +4656,7 @@
                 <w:u w:color="ffffff"/>
                 <w:shd w:val="nil" w:color="auto" w:fill="auto"/>
                 <w:rtl w:val="0"/>
+                <w:lang w:val="en-US"/>
                 <w14:textFill>
                   <w14:solidFill>
                     <w14:srgbClr w14:val="FFFFFF"/>
@@ -3984,12 +4694,6 @@
                 <w:tab w:val="left" w:pos="2160"/>
                 <w:tab w:val="left" w:pos="2880"/>
               </w:tabs>
-              <w:bidi w:val="0"/>
-              <w:ind w:left="0" w:right="0" w:firstLine="0"/>
-              <w:jc w:val="left"/>
-              <w:rPr>
-                <w:rtl w:val="0"/>
-              </w:rPr>
             </w:pPr>
             <w:r>
               <w:rPr>
@@ -4020,7 +4724,7 @@
           <w:shd w:val="clear" w:color="auto" w:fill="ced7e7"/>
         </w:tblPrEx>
         <w:trPr>
-          <w:trHeight w:val="434" w:hRule="atLeast"/>
+          <w:trHeight w:val="437" w:hRule="atLeast"/>
         </w:trPr>
         <w:tc>
           <w:tcPr>
@@ -4046,21 +4750,15 @@
               <w:tabs>
                 <w:tab w:val="left" w:pos="720"/>
               </w:tabs>
-              <w:bidi w:val="0"/>
-              <w:ind w:left="0" w:right="0" w:firstLine="0"/>
-              <w:jc w:val="left"/>
-              <w:rPr>
-                <w:rtl w:val="0"/>
-              </w:rPr>
             </w:pPr>
             <w:r>
               <w:rPr>
                 <w:rFonts w:ascii="Times New Roman" w:hAnsi="Times New Roman"/>
                 <w:sz w:val="17"/>
                 <w:szCs w:val="17"/>
-                <w:u w:color="000000"/>
                 <w:shd w:val="nil" w:color="auto" w:fill="auto"/>
                 <w:rtl w:val="0"/>
+                <w:lang w:val="en-US"/>
               </w:rPr>
               <w:t>N1</w:t>
             </w:r>
@@ -4091,21 +4789,15 @@
                 <w:tab w:val="left" w:pos="720"/>
                 <w:tab w:val="left" w:pos="1440"/>
               </w:tabs>
-              <w:bidi w:val="0"/>
-              <w:ind w:left="0" w:right="0" w:firstLine="0"/>
-              <w:jc w:val="left"/>
-              <w:rPr>
-                <w:rtl w:val="0"/>
-              </w:rPr>
             </w:pPr>
             <w:r>
               <w:rPr>
                 <w:rFonts w:ascii="Times New Roman" w:hAnsi="Times New Roman"/>
                 <w:sz w:val="17"/>
                 <w:szCs w:val="17"/>
-                <w:u w:color="000000"/>
                 <w:shd w:val="nil" w:color="auto" w:fill="auto"/>
                 <w:rtl w:val="0"/>
+                <w:lang w:val="en-US"/>
               </w:rPr>
               <w:t>Automatic</w:t>
             </w:r>
@@ -4138,19 +4830,12 @@
                 <w:tab w:val="left" w:pos="2160"/>
                 <w:tab w:val="left" w:pos="2880"/>
               </w:tabs>
-              <w:bidi w:val="0"/>
-              <w:ind w:left="0" w:right="0" w:firstLine="0"/>
-              <w:jc w:val="left"/>
-              <w:rPr>
-                <w:rtl w:val="0"/>
-              </w:rPr>
             </w:pPr>
             <w:r>
               <w:rPr>
                 <w:rFonts w:ascii="Times New Roman" w:hAnsi="Times New Roman"/>
                 <w:sz w:val="17"/>
                 <w:szCs w:val="17"/>
-                <w:u w:color="000000"/>
                 <w:shd w:val="nil" w:color="auto" w:fill="auto"/>
                 <w:rtl w:val="0"/>
                 <w:lang w:val="en-US"/>
@@ -4186,19 +4871,12 @@
                 <w:tab w:val="left" w:pos="2160"/>
                 <w:tab w:val="left" w:pos="2880"/>
               </w:tabs>
-              <w:bidi w:val="0"/>
-              <w:ind w:left="0" w:right="0" w:firstLine="0"/>
-              <w:jc w:val="left"/>
-              <w:rPr>
-                <w:rtl w:val="0"/>
-              </w:rPr>
             </w:pPr>
             <w:r>
               <w:rPr>
                 <w:rFonts w:ascii="Times New Roman" w:hAnsi="Times New Roman"/>
                 <w:sz w:val="17"/>
                 <w:szCs w:val="17"/>
-                <w:u w:color="000000"/>
                 <w:shd w:val="nil" w:color="auto" w:fill="auto"/>
                 <w:rtl w:val="0"/>
                 <w:lang w:val="en-US"/>
@@ -4213,7 +4891,7 @@
           <w:shd w:val="clear" w:color="auto" w:fill="ced7e7"/>
         </w:tblPrEx>
         <w:trPr>
-          <w:trHeight w:val="434" w:hRule="atLeast"/>
+          <w:trHeight w:val="437" w:hRule="atLeast"/>
         </w:trPr>
         <w:tc>
           <w:tcPr>
@@ -4239,21 +4917,15 @@
               <w:tabs>
                 <w:tab w:val="left" w:pos="720"/>
               </w:tabs>
-              <w:bidi w:val="0"/>
-              <w:ind w:left="0" w:right="0" w:firstLine="0"/>
-              <w:jc w:val="left"/>
-              <w:rPr>
-                <w:rtl w:val="0"/>
-              </w:rPr>
             </w:pPr>
             <w:r>
               <w:rPr>
                 <w:rFonts w:ascii="Times New Roman" w:hAnsi="Times New Roman"/>
                 <w:sz w:val="17"/>
                 <w:szCs w:val="17"/>
-                <w:u w:color="000000"/>
                 <w:shd w:val="nil" w:color="auto" w:fill="auto"/>
                 <w:rtl w:val="0"/>
+                <w:lang w:val="en-US"/>
               </w:rPr>
               <w:t>N2</w:t>
             </w:r>
@@ -4284,19 +4956,12 @@
                 <w:tab w:val="left" w:pos="720"/>
                 <w:tab w:val="left" w:pos="1440"/>
               </w:tabs>
-              <w:bidi w:val="0"/>
-              <w:ind w:left="0" w:right="0" w:firstLine="0"/>
-              <w:jc w:val="left"/>
-              <w:rPr>
-                <w:rtl w:val="0"/>
-              </w:rPr>
             </w:pPr>
             <w:r>
               <w:rPr>
                 <w:rFonts w:ascii="Times New Roman" w:hAnsi="Times New Roman"/>
                 <w:sz w:val="17"/>
                 <w:szCs w:val="17"/>
-                <w:u w:color="000000"/>
                 <w:shd w:val="nil" w:color="auto" w:fill="auto"/>
                 <w:rtl w:val="0"/>
                 <w:lang w:val="en-US"/>
@@ -4332,19 +4997,12 @@
                 <w:tab w:val="left" w:pos="2160"/>
                 <w:tab w:val="left" w:pos="2880"/>
               </w:tabs>
-              <w:bidi w:val="0"/>
-              <w:ind w:left="0" w:right="0" w:firstLine="0"/>
-              <w:jc w:val="left"/>
-              <w:rPr>
-                <w:rtl w:val="0"/>
-              </w:rPr>
             </w:pPr>
             <w:r>
               <w:rPr>
                 <w:rFonts w:ascii="Times New Roman" w:hAnsi="Times New Roman"/>
                 <w:sz w:val="17"/>
                 <w:szCs w:val="17"/>
-                <w:u w:color="000000"/>
                 <w:shd w:val="nil" w:color="auto" w:fill="auto"/>
                 <w:rtl w:val="0"/>
                 <w:lang w:val="en-US"/>
@@ -4380,19 +5038,12 @@
                 <w:tab w:val="left" w:pos="2160"/>
                 <w:tab w:val="left" w:pos="2880"/>
               </w:tabs>
-              <w:bidi w:val="0"/>
-              <w:ind w:left="0" w:right="0" w:firstLine="0"/>
-              <w:jc w:val="left"/>
-              <w:rPr>
-                <w:rtl w:val="0"/>
-              </w:rPr>
             </w:pPr>
             <w:r>
               <w:rPr>
                 <w:rFonts w:ascii="Times New Roman" w:hAnsi="Times New Roman"/>
                 <w:sz w:val="17"/>
                 <w:szCs w:val="17"/>
-                <w:u w:color="000000"/>
                 <w:shd w:val="nil" w:color="auto" w:fill="auto"/>
                 <w:rtl w:val="0"/>
                 <w:lang w:val="en-US"/>
@@ -4407,7 +5058,7 @@
           <w:shd w:val="clear" w:color="auto" w:fill="ced7e7"/>
         </w:tblPrEx>
         <w:trPr>
-          <w:trHeight w:val="434" w:hRule="atLeast"/>
+          <w:trHeight w:val="437" w:hRule="atLeast"/>
         </w:trPr>
         <w:tc>
           <w:tcPr>
@@ -4433,21 +5084,15 @@
               <w:tabs>
                 <w:tab w:val="left" w:pos="720"/>
               </w:tabs>
-              <w:bidi w:val="0"/>
-              <w:ind w:left="0" w:right="0" w:firstLine="0"/>
-              <w:jc w:val="left"/>
-              <w:rPr>
-                <w:rtl w:val="0"/>
-              </w:rPr>
             </w:pPr>
             <w:r>
               <w:rPr>
                 <w:rFonts w:ascii="Times New Roman" w:hAnsi="Times New Roman"/>
                 <w:sz w:val="17"/>
                 <w:szCs w:val="17"/>
-                <w:u w:color="000000"/>
                 <w:shd w:val="nil" w:color="auto" w:fill="auto"/>
                 <w:rtl w:val="0"/>
+                <w:lang w:val="en-US"/>
               </w:rPr>
               <w:t>N3</w:t>
             </w:r>
@@ -4478,19 +5123,12 @@
                 <w:tab w:val="left" w:pos="720"/>
                 <w:tab w:val="left" w:pos="1440"/>
               </w:tabs>
-              <w:bidi w:val="0"/>
-              <w:ind w:left="0" w:right="0" w:firstLine="0"/>
-              <w:jc w:val="left"/>
-              <w:rPr>
-                <w:rtl w:val="0"/>
-              </w:rPr>
             </w:pPr>
             <w:r>
               <w:rPr>
                 <w:rFonts w:ascii="Times New Roman" w:hAnsi="Times New Roman"/>
                 <w:sz w:val="17"/>
                 <w:szCs w:val="17"/>
-                <w:u w:color="000000"/>
                 <w:shd w:val="nil" w:color="auto" w:fill="auto"/>
                 <w:rtl w:val="0"/>
                 <w:lang w:val="en-US"/>
@@ -4526,19 +5164,12 @@
                 <w:tab w:val="left" w:pos="2160"/>
                 <w:tab w:val="left" w:pos="2880"/>
               </w:tabs>
-              <w:bidi w:val="0"/>
-              <w:ind w:left="0" w:right="0" w:firstLine="0"/>
-              <w:jc w:val="left"/>
-              <w:rPr>
-                <w:rtl w:val="0"/>
-              </w:rPr>
             </w:pPr>
             <w:r>
               <w:rPr>
                 <w:rFonts w:ascii="Times New Roman" w:hAnsi="Times New Roman"/>
                 <w:sz w:val="17"/>
                 <w:szCs w:val="17"/>
-                <w:u w:color="000000"/>
                 <w:shd w:val="nil" w:color="auto" w:fill="auto"/>
                 <w:rtl w:val="0"/>
                 <w:lang w:val="en-US"/>
@@ -4574,19 +5205,12 @@
                 <w:tab w:val="left" w:pos="2160"/>
                 <w:tab w:val="left" w:pos="2880"/>
               </w:tabs>
-              <w:bidi w:val="0"/>
-              <w:ind w:left="0" w:right="0" w:firstLine="0"/>
-              <w:jc w:val="left"/>
-              <w:rPr>
-                <w:rtl w:val="0"/>
-              </w:rPr>
             </w:pPr>
             <w:r>
               <w:rPr>
                 <w:rFonts w:ascii="Times New Roman" w:hAnsi="Times New Roman"/>
                 <w:sz w:val="17"/>
                 <w:szCs w:val="17"/>
-                <w:u w:color="000000"/>
                 <w:shd w:val="nil" w:color="auto" w:fill="auto"/>
                 <w:rtl w:val="0"/>
                 <w:lang w:val="en-US"/>
@@ -4601,7 +5225,7 @@
           <w:shd w:val="clear" w:color="auto" w:fill="ced7e7"/>
         </w:tblPrEx>
         <w:trPr>
-          <w:trHeight w:val="434" w:hRule="atLeast"/>
+          <w:trHeight w:val="437" w:hRule="atLeast"/>
         </w:trPr>
         <w:tc>
           <w:tcPr>
@@ -4627,21 +5251,15 @@
               <w:tabs>
                 <w:tab w:val="left" w:pos="720"/>
               </w:tabs>
-              <w:bidi w:val="0"/>
-              <w:ind w:left="0" w:right="0" w:firstLine="0"/>
-              <w:jc w:val="left"/>
-              <w:rPr>
-                <w:rtl w:val="0"/>
-              </w:rPr>
             </w:pPr>
             <w:r>
               <w:rPr>
                 <w:rFonts w:ascii="Times New Roman" w:hAnsi="Times New Roman"/>
                 <w:sz w:val="17"/>
                 <w:szCs w:val="17"/>
-                <w:u w:color="000000"/>
                 <w:shd w:val="nil" w:color="auto" w:fill="auto"/>
                 <w:rtl w:val="0"/>
+                <w:lang w:val="en-US"/>
               </w:rPr>
               <w:t>N4</w:t>
             </w:r>
@@ -4672,19 +5290,12 @@
                 <w:tab w:val="left" w:pos="720"/>
                 <w:tab w:val="left" w:pos="1440"/>
               </w:tabs>
-              <w:bidi w:val="0"/>
-              <w:ind w:left="0" w:right="0" w:firstLine="0"/>
-              <w:jc w:val="left"/>
-              <w:rPr>
-                <w:rtl w:val="0"/>
-              </w:rPr>
             </w:pPr>
             <w:r>
               <w:rPr>
                 <w:rFonts w:ascii="Times New Roman" w:hAnsi="Times New Roman"/>
                 <w:sz w:val="17"/>
                 <w:szCs w:val="17"/>
-                <w:u w:color="000000"/>
                 <w:shd w:val="nil" w:color="auto" w:fill="auto"/>
                 <w:rtl w:val="0"/>
                 <w:lang w:val="nl-NL"/>
@@ -4720,19 +5331,12 @@
                 <w:tab w:val="left" w:pos="2160"/>
                 <w:tab w:val="left" w:pos="2880"/>
               </w:tabs>
-              <w:bidi w:val="0"/>
-              <w:ind w:left="0" w:right="0" w:firstLine="0"/>
-              <w:jc w:val="left"/>
-              <w:rPr>
-                <w:rtl w:val="0"/>
-              </w:rPr>
             </w:pPr>
             <w:r>
               <w:rPr>
                 <w:rFonts w:ascii="Times New Roman" w:hAnsi="Times New Roman"/>
                 <w:sz w:val="17"/>
                 <w:szCs w:val="17"/>
-                <w:u w:color="000000"/>
                 <w:shd w:val="nil" w:color="auto" w:fill="auto"/>
                 <w:rtl w:val="0"/>
                 <w:lang w:val="en-US"/>
@@ -4768,19 +5372,12 @@
                 <w:tab w:val="left" w:pos="2160"/>
                 <w:tab w:val="left" w:pos="2880"/>
               </w:tabs>
-              <w:bidi w:val="0"/>
-              <w:ind w:left="0" w:right="0" w:firstLine="0"/>
-              <w:jc w:val="left"/>
-              <w:rPr>
-                <w:rtl w:val="0"/>
-              </w:rPr>
             </w:pPr>
             <w:r>
               <w:rPr>
                 <w:rFonts w:ascii="Times New Roman" w:hAnsi="Times New Roman"/>
                 <w:sz w:val="17"/>
                 <w:szCs w:val="17"/>
-                <w:u w:color="000000"/>
                 <w:shd w:val="nil" w:color="auto" w:fill="auto"/>
                 <w:rtl w:val="0"/>
                 <w:lang w:val="en-US"/>
@@ -4796,6 +5393,7 @@
         <w:pStyle w:val="Heading 2"/>
         <w:widowControl w:val="0"/>
         <w:spacing w:before="240" w:after="120"/>
+        <w:ind w:left="108" w:hanging="108"/>
       </w:pPr>
     </w:p>
     <w:p>
@@ -4804,6 +5402,13 @@
         <w:widowControl w:val="0"/>
         <w:spacing w:before="240" w:after="120"/>
       </w:pPr>
+    </w:p>
+    <w:p>
+      <w:pPr>
+        <w:pStyle w:val="Heading 2"/>
+        <w:widowControl w:val="0"/>
+        <w:spacing w:before="240" w:after="120"/>
+      </w:pPr>
       <w:r>
         <w:rPr>
           <w:b w:val="0"/>
@@ -4828,6 +5433,9 @@
       <w:pPr>
         <w:pStyle w:val="Heading 2"/>
         <w:spacing w:before="240" w:after="120"/>
+        <w:rPr>
+          <w:lang w:val="fr-FR"/>
+        </w:rPr>
       </w:pPr>
       <w:r>
         <w:rPr>
@@ -4869,8 +5477,12 @@
           <w:ilvl w:val="0"/>
           <w:numId w:val="2"/>
         </w:numPr>
+        <w:bidi w:val="0"/>
         <w:spacing w:after="80"/>
-        <w:rPr>
+        <w:ind w:right="0"/>
+        <w:jc w:val="left"/>
+        <w:rPr>
+          <w:rtl w:val="0"/>
           <w:lang w:val="en-US"/>
         </w:rPr>
       </w:pPr>
@@ -4897,8 +5509,12 @@
           <w:ilvl w:val="0"/>
           <w:numId w:val="2"/>
         </w:numPr>
+        <w:bidi w:val="0"/>
         <w:spacing w:after="80"/>
-        <w:rPr>
+        <w:ind w:right="0"/>
+        <w:jc w:val="left"/>
+        <w:rPr>
+          <w:rtl w:val="0"/>
           <w:lang w:val="en-US"/>
         </w:rPr>
       </w:pPr>
@@ -4925,8 +5541,12 @@
           <w:ilvl w:val="0"/>
           <w:numId w:val="2"/>
         </w:numPr>
+        <w:bidi w:val="0"/>
         <w:spacing w:after="80"/>
-        <w:rPr>
+        <w:ind w:right="0"/>
+        <w:jc w:val="left"/>
+        <w:rPr>
+          <w:rtl w:val="0"/>
           <w:lang w:val="en-US"/>
         </w:rPr>
       </w:pPr>
@@ -4953,8 +5573,12 @@
           <w:ilvl w:val="0"/>
           <w:numId w:val="2"/>
         </w:numPr>
+        <w:bidi w:val="0"/>
         <w:spacing w:after="80"/>
-        <w:rPr>
+        <w:ind w:right="0"/>
+        <w:jc w:val="left"/>
+        <w:rPr>
+          <w:rtl w:val="0"/>
           <w:lang w:val="en-US"/>
         </w:rPr>
       </w:pPr>
@@ -4981,8 +5605,12 @@
           <w:ilvl w:val="0"/>
           <w:numId w:val="2"/>
         </w:numPr>
+        <w:bidi w:val="0"/>
         <w:spacing w:after="80"/>
-        <w:rPr>
+        <w:ind w:right="0"/>
+        <w:jc w:val="left"/>
+        <w:rPr>
+          <w:rtl w:val="0"/>
           <w:lang w:val="en-US"/>
         </w:rPr>
       </w:pPr>
@@ -5009,8 +5637,12 @@
           <w:ilvl w:val="0"/>
           <w:numId w:val="2"/>
         </w:numPr>
+        <w:bidi w:val="0"/>
         <w:spacing w:after="80"/>
-        <w:rPr>
+        <w:ind w:right="0"/>
+        <w:jc w:val="left"/>
+        <w:rPr>
+          <w:rtl w:val="0"/>
           <w:lang w:val="en-US"/>
         </w:rPr>
       </w:pPr>
@@ -5037,8 +5669,12 @@
           <w:ilvl w:val="0"/>
           <w:numId w:val="2"/>
         </w:numPr>
+        <w:bidi w:val="0"/>
         <w:spacing w:after="80"/>
-        <w:rPr>
+        <w:ind w:right="0"/>
+        <w:jc w:val="left"/>
+        <w:rPr>
+          <w:rtl w:val="0"/>
           <w:lang w:val="en-US"/>
         </w:rPr>
       </w:pPr>
@@ -5086,35 +5722,30 @@
       </w:pPr>
       <w:r>
         <w:rPr>
-          <w:rtl w:val="0"/>
-          <w:lang w:val="en-US"/>
-        </w:rPr>
-        <w:t>5. MCP Tool Integration</w:t>
+          <w:rFonts w:ascii="Arial Unicode MS" w:cs="Arial Unicode MS" w:hAnsi="Arial Unicode MS" w:eastAsia="Arial Unicode MS"/>
+          <w:b w:val="0"/>
+          <w:bCs w:val="0"/>
+          <w:i w:val="0"/>
+          <w:iCs w:val="0"/>
+          <w:lang w:val="en-US"/>
+        </w:rPr>
+        <w:br w:type="page"/>
       </w:r>
     </w:p>
     <w:p>
       <w:pPr>
         <w:pStyle w:val="Heading"/>
         <w:spacing w:before="240"/>
-      </w:pPr>
-      <w:r>
-        <w:rPr>
-          <w:b w:val="0"/>
-          <w:bCs w:val="0"/>
-          <w:outline w:val="0"/>
-          <w:color w:val="000000"/>
-          <w:sz w:val="20"/>
-          <w:szCs w:val="20"/>
-          <w:u w:color="000000"/>
-          <w:rtl w:val="0"/>
-          <w:lang w:val="en-US"/>
-          <w14:textFill>
-            <w14:solidFill>
-              <w14:srgbClr w14:val="000000"/>
-            </w14:solidFill>
-          </w14:textFill>
-        </w:rPr>
-        <w:t>AccountingAgents is MCP-native by design. Rather than implementing custom API wrappers for each external service — an approach that creates fragile, maintenance-heavy integrations — all tool access is mediated through official Model Context Protocol servers. This provides two key benefits: (1) authentication and authorization are handled by established OAuth2 flows, and (2) tool availability and capability evolve with the MCP specification independently of the agent framework.</w:t>
+        <w:rPr>
+          <w:lang w:val="en-US"/>
+        </w:rPr>
+      </w:pPr>
+      <w:r>
+        <w:rPr>
+          <w:rtl w:val="0"/>
+          <w:lang w:val="en-US"/>
+        </w:rPr>
+        <w:t>5. MCP Tool Integration</w:t>
       </w:r>
     </w:p>
     <w:p>
@@ -5122,6 +5753,110 @@
         <w:pStyle w:val="Heading"/>
         <w:spacing w:before="240"/>
         <w:rPr>
+          <w:lang w:val="en-US"/>
+        </w:rPr>
+      </w:pPr>
+      <w:r>
+        <w:rPr>
+          <w:b w:val="0"/>
+          <w:bCs w:val="0"/>
+          <w:outline w:val="0"/>
+          <w:color w:val="000000"/>
+          <w:sz w:val="20"/>
+          <w:szCs w:val="20"/>
+          <w:u w:color="000000"/>
+          <w:rtl w:val="0"/>
+          <w:lang w:val="en-US"/>
+          <w14:textFill>
+            <w14:solidFill>
+              <w14:srgbClr w14:val="000000"/>
+            </w14:solidFill>
+          </w14:textFill>
+        </w:rPr>
+        <w:t xml:space="preserve">AccountingAgents is MCP-native by design. Rather than implementing custom API wrappers for each external service </w:t>
+      </w:r>
+      <w:r>
+        <w:rPr>
+          <w:b w:val="0"/>
+          <w:bCs w:val="0"/>
+          <w:outline w:val="0"/>
+          <w:color w:val="000000"/>
+          <w:sz w:val="20"/>
+          <w:szCs w:val="20"/>
+          <w:u w:color="000000"/>
+          <w:rtl w:val="0"/>
+          <w:lang w:val="en-US"/>
+          <w14:textFill>
+            <w14:solidFill>
+              <w14:srgbClr w14:val="000000"/>
+            </w14:solidFill>
+          </w14:textFill>
+        </w:rPr>
+        <w:t xml:space="preserve">— </w:t>
+      </w:r>
+      <w:r>
+        <w:rPr>
+          <w:b w:val="0"/>
+          <w:bCs w:val="0"/>
+          <w:outline w:val="0"/>
+          <w:color w:val="000000"/>
+          <w:sz w:val="20"/>
+          <w:szCs w:val="20"/>
+          <w:u w:color="000000"/>
+          <w:rtl w:val="0"/>
+          <w:lang w:val="en-US"/>
+          <w14:textFill>
+            <w14:solidFill>
+              <w14:srgbClr w14:val="000000"/>
+            </w14:solidFill>
+          </w14:textFill>
+        </w:rPr>
+        <w:t xml:space="preserve">an approach that creates fragile, maintenance-heavy integrations </w:t>
+      </w:r>
+      <w:r>
+        <w:rPr>
+          <w:b w:val="0"/>
+          <w:bCs w:val="0"/>
+          <w:outline w:val="0"/>
+          <w:color w:val="000000"/>
+          <w:sz w:val="20"/>
+          <w:szCs w:val="20"/>
+          <w:u w:color="000000"/>
+          <w:rtl w:val="0"/>
+          <w:lang w:val="en-US"/>
+          <w14:textFill>
+            <w14:solidFill>
+              <w14:srgbClr w14:val="000000"/>
+            </w14:solidFill>
+          </w14:textFill>
+        </w:rPr>
+        <w:t xml:space="preserve">— </w:t>
+      </w:r>
+      <w:r>
+        <w:rPr>
+          <w:b w:val="0"/>
+          <w:bCs w:val="0"/>
+          <w:outline w:val="0"/>
+          <w:color w:val="000000"/>
+          <w:sz w:val="20"/>
+          <w:szCs w:val="20"/>
+          <w:u w:color="000000"/>
+          <w:rtl w:val="0"/>
+          <w:lang w:val="en-US"/>
+          <w14:textFill>
+            <w14:solidFill>
+              <w14:srgbClr w14:val="000000"/>
+            </w14:solidFill>
+          </w14:textFill>
+        </w:rPr>
+        <w:t>all tool access is mediated through official Model Context Protocol servers. This provides two key benefits: (1) authentication and authorization are handled by established OAuth2 flows, and (2) tool availability and capability evolve with the MCP specification independently of the agent framework.</w:t>
+      </w:r>
+    </w:p>
+    <w:p>
+      <w:pPr>
+        <w:pStyle w:val="Heading"/>
+        <w:spacing w:before="240"/>
+        <w:rPr>
           <w:b w:val="0"/>
           <w:bCs w:val="0"/>
           <w:outline w:val="0"/>
@@ -5346,6 +6081,7 @@
           <w:szCs w:val="20"/>
           <w:u w:color="000000"/>
           <w:rtl w:val="0"/>
+          <w:lang w:val="fr-FR"/>
           <w14:textFill>
             <w14:solidFill>
               <w14:srgbClr w14:val="000000"/>
@@ -5390,7 +6126,7 @@
           <w:tab w:val="left" w:pos="7200"/>
           <w:tab w:val="left" w:pos="7920"/>
           <w:tab w:val="left" w:pos="8640"/>
-          <w:tab w:val="left" w:pos="9360"/>
+          <w:tab w:val="left" w:pos="9220"/>
         </w:tabs>
         <w:suppressAutoHyphens w:val="1"/>
         <w:spacing w:before="0" w:line="240" w:lineRule="auto"/>
@@ -5421,6 +6157,9 @@
       <w:pPr>
         <w:pStyle w:val="Heading"/>
         <w:spacing w:before="240"/>
+        <w:rPr>
+          <w:lang w:val="en-US"/>
+        </w:rPr>
       </w:pPr>
       <w:r>
         <w:rPr>
@@ -5497,6 +6236,9 @@
       <w:pPr>
         <w:pStyle w:val="Heading"/>
         <w:spacing w:before="240"/>
+        <w:rPr>
+          <w:lang w:val="it-IT"/>
+        </w:rPr>
       </w:pPr>
       <w:r>
         <w:rPr>
@@ -5510,25 +6252,104 @@
       <w:pPr>
         <w:pStyle w:val="Heading"/>
         <w:spacing w:before="240"/>
-      </w:pPr>
-      <w:r>
-        <w:rPr>
-          <w:b w:val="0"/>
-          <w:bCs w:val="0"/>
-          <w:outline w:val="0"/>
-          <w:color w:val="000000"/>
-          <w:sz w:val="20"/>
-          <w:szCs w:val="20"/>
-          <w:u w:color="000000"/>
-          <w:rtl w:val="0"/>
-          <w:lang w:val="en-US"/>
-          <w14:textFill>
-            <w14:solidFill>
-              <w14:srgbClr w14:val="000000"/>
-            </w14:solidFill>
-          </w14:textFill>
-        </w:rPr>
-        <w:t>We have presented AccountingAgents, a multi-agent LLM framework modelled on the organizational structure of professional accounting firms. The framework addresses the two core limitations identified in prior work — absence of realistic organizational modelling and inefficient communication interfaces — by adopting the structured SharedState design pioneered by TradingAgents and extending it to the accounting domain. The asynchronous HITL mechanism represents a practical contribution to the deployment of agentic systems in regulated, high-stakes environments where human oversight is legally required but operators are mobile. We invite the research community to build on this framework and to contribute experimental validation.</w:t>
+        <w:rPr>
+          <w:lang w:val="en-US"/>
+        </w:rPr>
+      </w:pPr>
+      <w:r>
+        <w:rPr>
+          <w:b w:val="0"/>
+          <w:bCs w:val="0"/>
+          <w:outline w:val="0"/>
+          <w:color w:val="000000"/>
+          <w:sz w:val="20"/>
+          <w:szCs w:val="20"/>
+          <w:u w:color="000000"/>
+          <w:rtl w:val="0"/>
+          <w:lang w:val="en-US"/>
+          <w14:textFill>
+            <w14:solidFill>
+              <w14:srgbClr w14:val="000000"/>
+            </w14:solidFill>
+          </w14:textFill>
+        </w:rPr>
+        <w:t xml:space="preserve">We have presented AccountingAgents, a multi-agent LLM framework modelled on the organizational structure of professional accounting firms. The framework addresses the two core limitations identified in prior work </w:t>
+      </w:r>
+      <w:r>
+        <w:rPr>
+          <w:b w:val="0"/>
+          <w:bCs w:val="0"/>
+          <w:outline w:val="0"/>
+          <w:color w:val="000000"/>
+          <w:sz w:val="20"/>
+          <w:szCs w:val="20"/>
+          <w:u w:color="000000"/>
+          <w:rtl w:val="0"/>
+          <w:lang w:val="en-US"/>
+          <w14:textFill>
+            <w14:solidFill>
+              <w14:srgbClr w14:val="000000"/>
+            </w14:solidFill>
+          </w14:textFill>
+        </w:rPr>
+        <w:t xml:space="preserve">— </w:t>
+      </w:r>
+      <w:r>
+        <w:rPr>
+          <w:b w:val="0"/>
+          <w:bCs w:val="0"/>
+          <w:outline w:val="0"/>
+          <w:color w:val="000000"/>
+          <w:sz w:val="20"/>
+          <w:szCs w:val="20"/>
+          <w:u w:color="000000"/>
+          <w:rtl w:val="0"/>
+          <w:lang w:val="en-US"/>
+          <w14:textFill>
+            <w14:solidFill>
+              <w14:srgbClr w14:val="000000"/>
+            </w14:solidFill>
+          </w14:textFill>
+        </w:rPr>
+        <w:t xml:space="preserve">absence of realistic organizational modelling and inefficient communication interfaces </w:t>
+      </w:r>
+      <w:r>
+        <w:rPr>
+          <w:b w:val="0"/>
+          <w:bCs w:val="0"/>
+          <w:outline w:val="0"/>
+          <w:color w:val="000000"/>
+          <w:sz w:val="20"/>
+          <w:szCs w:val="20"/>
+          <w:u w:color="000000"/>
+          <w:rtl w:val="0"/>
+          <w:lang w:val="en-US"/>
+          <w14:textFill>
+            <w14:solidFill>
+              <w14:srgbClr w14:val="000000"/>
+            </w14:solidFill>
+          </w14:textFill>
+        </w:rPr>
+        <w:t xml:space="preserve">— </w:t>
+      </w:r>
+      <w:r>
+        <w:rPr>
+          <w:b w:val="0"/>
+          <w:bCs w:val="0"/>
+          <w:outline w:val="0"/>
+          <w:color w:val="000000"/>
+          <w:sz w:val="20"/>
+          <w:szCs w:val="20"/>
+          <w:u w:color="000000"/>
+          <w:rtl w:val="0"/>
+          <w:lang w:val="en-US"/>
+          <w14:textFill>
+            <w14:solidFill>
+              <w14:srgbClr w14:val="000000"/>
+            </w14:solidFill>
+          </w14:textFill>
+        </w:rPr>
+        <w:t>by adopting the structured SharedState design pioneered by TradingAgents and extending it to the accounting domain. The asynchronous HITL mechanism represents a practical contribution to the deployment of agentic systems in regulated, high-stakes environments where human oversight is legally required but operators are mobile. We invite the research community to build on this framework and to contribute experimental validation.</w:t>
       </w:r>
     </w:p>
     <w:p>
@@ -5544,10 +6365,13 @@
       </w:pPr>
       <w:r>
         <w:rPr>
-          <w:rtl w:val="0"/>
-          <w:lang w:val="fr-FR"/>
-        </w:rPr>
-        <w:t>References</w:t>
+          <w:rFonts w:ascii="Arial Unicode MS" w:cs="Arial Unicode MS" w:hAnsi="Arial Unicode MS" w:eastAsia="Arial Unicode MS"/>
+          <w:b w:val="0"/>
+          <w:bCs w:val="0"/>
+          <w:i w:val="0"/>
+          <w:iCs w:val="0"/>
+        </w:rPr>
+        <w:br w:type="page"/>
       </w:r>
     </w:p>
     <w:p>
@@ -5557,6 +6381,22 @@
       </w:pPr>
       <w:r>
         <w:rPr>
+          <w:rtl w:val="0"/>
+          <w:lang w:val="fr-FR"/>
+        </w:rPr>
+        <w:t>References</w:t>
+      </w:r>
+    </w:p>
+    <w:p>
+      <w:pPr>
+        <w:pStyle w:val="Heading"/>
+        <w:spacing w:before="240"/>
+        <w:rPr>
+          <w:lang w:val="en-US"/>
+        </w:rPr>
+      </w:pPr>
+      <w:r>
+        <w:rPr>
           <w:sz w:val="17"/>
           <w:szCs w:val="17"/>
           <w:rtl w:val="0"/>
@@ -5569,6 +6409,9 @@
       <w:pPr>
         <w:pStyle w:val="Heading"/>
         <w:spacing w:before="240"/>
+        <w:rPr>
+          <w:lang w:val="en-US"/>
+        </w:rPr>
       </w:pPr>
       <w:r>
         <w:rPr>
@@ -5584,6 +6427,9 @@
       <w:pPr>
         <w:pStyle w:val="Heading"/>
         <w:spacing w:before="240"/>
+        <w:rPr>
+          <w:lang w:val="en-US"/>
+        </w:rPr>
       </w:pPr>
       <w:r>
         <w:rPr>
@@ -5599,6 +6445,9 @@
       <w:pPr>
         <w:pStyle w:val="Heading"/>
         <w:spacing w:before="240"/>
+        <w:rPr>
+          <w:lang w:val="en-US"/>
+        </w:rPr>
       </w:pPr>
       <w:r>
         <w:rPr>
@@ -5614,6 +6463,9 @@
       <w:pPr>
         <w:pStyle w:val="Heading"/>
         <w:spacing w:before="240"/>
+        <w:rPr>
+          <w:lang w:val="en-US"/>
+        </w:rPr>
       </w:pPr>
       <w:r>
         <w:rPr>
@@ -5662,6 +6514,9 @@
       <w:pPr>
         <w:pStyle w:val="Heading"/>
         <w:spacing w:before="240"/>
+        <w:rPr>
+          <w:lang w:val="en-US"/>
+        </w:rPr>
       </w:pPr>
       <w:r>
         <w:rPr>
@@ -5677,6 +6532,9 @@
       <w:pPr>
         <w:pStyle w:val="Heading"/>
         <w:spacing w:before="240"/>
+        <w:rPr>
+          <w:lang w:val="en-US"/>
+        </w:rPr>
       </w:pPr>
       <w:r>
         <w:rPr>
@@ -5692,6 +6550,9 @@
       <w:pPr>
         <w:pStyle w:val="Heading"/>
         <w:spacing w:before="240"/>
+        <w:rPr>
+          <w:lang w:val="en-US"/>
+        </w:rPr>
       </w:pPr>
       <w:r>
         <w:rPr>
@@ -5707,6 +6568,9 @@
       <w:pPr>
         <w:pStyle w:val="Heading"/>
         <w:spacing w:before="240"/>
+        <w:rPr>
+          <w:lang w:val="en-US"/>
+        </w:rPr>
       </w:pPr>
       <w:r>
         <w:rPr>
@@ -5716,6 +6580,50 @@
           <w:lang w:val="en-US"/>
         </w:rPr>
         <w:t>[10] Intuit. quickbooks-online-mcp-server. github.com/intuit/quickbooks-online-mcp-server (2025).</w:t>
+      </w:r>
+    </w:p>
+    <w:p>
+      <w:pPr>
+        <w:pStyle w:val="Body"/>
+      </w:pPr>
+      <w:r>
+        <w:rPr>
+          <w:outline w:val="0"/>
+          <w:color w:val="000000"/>
+          <w:sz w:val="20"/>
+          <w:szCs w:val="20"/>
+          <w:u w:color="000000"/>
+          <w:rtl w:val="0"/>
+          <w:lang w:val="en-US"/>
+          <w14:textFill>
+            <w14:solidFill>
+              <w14:srgbClr w14:val="000000"/>
+            </w14:solidFill>
+          </w14:textFill>
+        </w:rPr>
+        <w:t>[11] Ramachandran, A. (2025). Enterprise Finance &amp; Accounting: Automation through Agentic and Multi-Agent AI Systems Leveraging Reasoning Models, Multimodal Interfaces, Reinforcement Learning, Graph Neural Networks, and Neuro-symbolic AI. ResearchGate. researchgate.net/publication/390209544</w:t>
+      </w:r>
+    </w:p>
+    <w:p>
+      <w:pPr>
+        <w:pStyle w:val="Body"/>
+      </w:pPr>
+      <w:r>
+        <w:rPr>
+          <w:outline w:val="0"/>
+          <w:color w:val="000000"/>
+          <w:sz w:val="20"/>
+          <w:szCs w:val="20"/>
+          <w:u w:color="000000"/>
+          <w:rtl w:val="0"/>
+          <w:lang w:val="en-US"/>
+          <w14:textFill>
+            <w14:solidFill>
+              <w14:srgbClr w14:val="000000"/>
+            </w14:solidFill>
+          </w14:textFill>
+        </w:rPr>
+        <w:t>[12] Barrak, A. (2025). Traceability and Accountability in Role-Specialized Multi-Agent LLM Pipelines. arXiv:2510.07614.</w:t>
       </w:r>
     </w:p>
     <w:sectPr>
@@ -5772,7 +6680,11 @@
         <w:ind w:left="720" w:hanging="360"/>
       </w:pPr>
       <w:rPr>
-        <w:rFonts w:hAnsi="Arial Unicode MS"/>
+        <w:rFonts w:ascii="Times New Roman" w:cs="Times New Roman" w:hAnsi="Times New Roman" w:eastAsia="Times New Roman"/>
+        <w:b w:val="0"/>
+        <w:bCs w:val="0"/>
+        <w:i w:val="0"/>
+        <w:iCs w:val="0"/>
         <w:caps w:val="0"/>
         <w:smallCaps w:val="0"/>
         <w:strike w:val="0"/>
@@ -5798,7 +6710,11 @@
         <w:ind w:left="720" w:hanging="360"/>
       </w:pPr>
       <w:rPr>
-        <w:rFonts w:hAnsi="Arial Unicode MS"/>
+        <w:rFonts w:ascii="Times New Roman" w:cs="Times New Roman" w:hAnsi="Times New Roman" w:eastAsia="Times New Roman"/>
+        <w:b w:val="0"/>
+        <w:bCs w:val="0"/>
+        <w:i w:val="0"/>
+        <w:iCs w:val="0"/>
         <w:caps w:val="0"/>
         <w:smallCaps w:val="0"/>
         <w:strike w:val="0"/>
@@ -5824,7 +6740,11 @@
         <w:ind w:left="720" w:hanging="360"/>
       </w:pPr>
       <w:rPr>
-        <w:rFonts w:hAnsi="Arial Unicode MS"/>
+        <w:rFonts w:ascii="Times New Roman" w:cs="Times New Roman" w:hAnsi="Times New Roman" w:eastAsia="Times New Roman"/>
+        <w:b w:val="0"/>
+        <w:bCs w:val="0"/>
+        <w:i w:val="0"/>
+        <w:iCs w:val="0"/>
         <w:caps w:val="0"/>
         <w:smallCaps w:val="0"/>
         <w:strike w:val="0"/>
@@ -5850,7 +6770,11 @@
         <w:ind w:left="720" w:hanging="360"/>
       </w:pPr>
       <w:rPr>
-        <w:rFonts w:hAnsi="Arial Unicode MS"/>
+        <w:rFonts w:ascii="Times New Roman" w:cs="Times New Roman" w:hAnsi="Times New Roman" w:eastAsia="Times New Roman"/>
+        <w:b w:val="0"/>
+        <w:bCs w:val="0"/>
+        <w:i w:val="0"/>
+        <w:iCs w:val="0"/>
         <w:caps w:val="0"/>
         <w:smallCaps w:val="0"/>
         <w:strike w:val="0"/>
@@ -5876,7 +6800,11 @@
         <w:ind w:left="720" w:hanging="360"/>
       </w:pPr>
       <w:rPr>
-        <w:rFonts w:hAnsi="Arial Unicode MS"/>
+        <w:rFonts w:ascii="Times New Roman" w:cs="Times New Roman" w:hAnsi="Times New Roman" w:eastAsia="Times New Roman"/>
+        <w:b w:val="0"/>
+        <w:bCs w:val="0"/>
+        <w:i w:val="0"/>
+        <w:iCs w:val="0"/>
         <w:caps w:val="0"/>
         <w:smallCaps w:val="0"/>
         <w:strike w:val="0"/>
@@ -5902,7 +6830,11 @@
         <w:ind w:left="720" w:hanging="360"/>
       </w:pPr>
       <w:rPr>
-        <w:rFonts w:hAnsi="Arial Unicode MS"/>
+        <w:rFonts w:ascii="Times New Roman" w:cs="Times New Roman" w:hAnsi="Times New Roman" w:eastAsia="Times New Roman"/>
+        <w:b w:val="0"/>
+        <w:bCs w:val="0"/>
+        <w:i w:val="0"/>
+        <w:iCs w:val="0"/>
         <w:caps w:val="0"/>
         <w:smallCaps w:val="0"/>
         <w:strike w:val="0"/>
@@ -5928,7 +6860,11 @@
         <w:ind w:left="720" w:hanging="360"/>
       </w:pPr>
       <w:rPr>
-        <w:rFonts w:hAnsi="Arial Unicode MS"/>
+        <w:rFonts w:ascii="Times New Roman" w:cs="Times New Roman" w:hAnsi="Times New Roman" w:eastAsia="Times New Roman"/>
+        <w:b w:val="0"/>
+        <w:bCs w:val="0"/>
+        <w:i w:val="0"/>
+        <w:iCs w:val="0"/>
         <w:caps w:val="0"/>
         <w:smallCaps w:val="0"/>
         <w:strike w:val="0"/>
@@ -5954,7 +6890,11 @@
         <w:ind w:left="720" w:hanging="360"/>
       </w:pPr>
       <w:rPr>
-        <w:rFonts w:hAnsi="Arial Unicode MS"/>
+        <w:rFonts w:ascii="Times New Roman" w:cs="Times New Roman" w:hAnsi="Times New Roman" w:eastAsia="Times New Roman"/>
+        <w:b w:val="0"/>
+        <w:bCs w:val="0"/>
+        <w:i w:val="0"/>
+        <w:iCs w:val="0"/>
         <w:caps w:val="0"/>
         <w:smallCaps w:val="0"/>
         <w:strike w:val="0"/>
@@ -5980,7 +6920,11 @@
         <w:ind w:left="720" w:hanging="360"/>
       </w:pPr>
       <w:rPr>
-        <w:rFonts w:hAnsi="Arial Unicode MS"/>
+        <w:rFonts w:ascii="Times New Roman" w:cs="Times New Roman" w:hAnsi="Times New Roman" w:eastAsia="Times New Roman"/>
+        <w:b w:val="0"/>
+        <w:bCs w:val="0"/>
+        <w:i w:val="0"/>
+        <w:iCs w:val="0"/>
         <w:caps w:val="0"/>
         <w:smallCaps w:val="0"/>
         <w:strike w:val="0"/>
@@ -6162,9 +7106,9 @@
       </w14:textFill>
     </w:rPr>
   </w:style>
-  <w:style w:type="paragraph" w:styleId="Body">
-    <w:name w:val="Body"/>
-    <w:next w:val="Body"/>
+  <w:style w:type="paragraph" w:styleId="Body A">
+    <w:name w:val="Body A"/>
+    <w:next w:val="Body A"/>
     <w:pPr>
       <w:keepNext w:val="0"/>
       <w:keepLines w:val="0"/>
@@ -6195,12 +7139,13 @@
       <w:position w:val="0"/>
       <w:sz w:val="22"/>
       <w:szCs w:val="22"/>
-      <w:u w:val="none"/>
+      <w:u w:val="none" w:color="000000"/>
       <w:shd w:val="nil" w:color="auto" w:fill="auto"/>
       <w:vertAlign w:val="baseline"/>
       <w:lang w:val="en-US"/>
-      <w14:textOutline>
+      <w14:textOutline w14:w="12700" w14:cap="flat">
         <w14:noFill/>
+        <w14:miter w14:lim="400000"/>
       </w14:textOutline>
       <w14:textFill>
         <w14:solidFill>
@@ -6246,8 +7191,9 @@
       <w:shd w:val="nil" w:color="auto" w:fill="auto"/>
       <w:vertAlign w:val="baseline"/>
       <w:lang w:val="fr-FR"/>
-      <w14:textOutline>
+      <w14:textOutline w14:w="12700" w14:cap="flat">
         <w14:noFill/>
+        <w14:miter w14:lim="400000"/>
       </w14:textOutline>
       <w14:textFill>
         <w14:solidFill>
@@ -6345,8 +7291,9 @@
       <w:shd w:val="nil" w:color="auto" w:fill="auto"/>
       <w:vertAlign w:val="baseline"/>
       <w:lang w:val="en-US"/>
-      <w14:textOutline>
+      <w14:textOutline w14:w="12700" w14:cap="flat">
         <w14:noFill/>
+        <w14:miter w14:lim="400000"/>
       </w14:textOutline>
       <w14:textFill>
         <w14:solidFill>
@@ -6388,7 +7335,55 @@
       <w:position w:val="0"/>
       <w:sz w:val="24"/>
       <w:szCs w:val="24"/>
-      <w:u w:val="none"/>
+      <w:u w:val="none" w:color="000000"/>
+      <w:shd w:val="nil" w:color="auto" w:fill="auto"/>
+      <w:vertAlign w:val="baseline"/>
+      <w:lang w:val="en-US"/>
+      <w14:textOutline w14:w="12700" w14:cap="flat">
+        <w14:noFill/>
+        <w14:miter w14:lim="400000"/>
+      </w14:textOutline>
+      <w14:textFill>
+        <w14:solidFill>
+          <w14:srgbClr w14:val="000000"/>
+        </w14:solidFill>
+      </w14:textFill>
+    </w:rPr>
+  </w:style>
+  <w:style w:type="paragraph" w:styleId="Body">
+    <w:name w:val="Body"/>
+    <w:next w:val="Body"/>
+    <w:pPr>
+      <w:keepNext w:val="0"/>
+      <w:keepLines w:val="0"/>
+      <w:pageBreakBefore w:val="0"/>
+      <w:widowControl w:val="1"/>
+      <w:shd w:val="clear" w:color="auto" w:fill="auto"/>
+      <w:suppressAutoHyphens w:val="0"/>
+      <w:bidi w:val="0"/>
+      <w:spacing w:before="0" w:after="0" w:line="240" w:lineRule="auto"/>
+      <w:ind w:left="0" w:right="0" w:firstLine="0"/>
+      <w:jc w:val="left"/>
+      <w:outlineLvl w:val="9"/>
+    </w:pPr>
+    <w:rPr>
+      <w:rFonts w:ascii="Times New Roman" w:cs="Arial Unicode MS" w:hAnsi="Times New Roman" w:eastAsia="Arial Unicode MS"/>
+      <w:b w:val="0"/>
+      <w:bCs w:val="0"/>
+      <w:i w:val="0"/>
+      <w:iCs w:val="0"/>
+      <w:caps w:val="0"/>
+      <w:smallCaps w:val="0"/>
+      <w:strike w:val="0"/>
+      <w:dstrike w:val="0"/>
+      <w:outline w:val="0"/>
+      <w:color w:val="000000"/>
+      <w:spacing w:val="0"/>
+      <w:kern w:val="0"/>
+      <w:position w:val="0"/>
+      <w:sz w:val="24"/>
+      <w:szCs w:val="24"/>
+      <w:u w:val="none" w:color="000000"/>
       <w:shd w:val="nil" w:color="auto" w:fill="auto"/>
       <w:vertAlign w:val="baseline"/>
       <w:lang w:val="en-US"/>
@@ -6537,13 +7532,7 @@
           <a:effectLst/>
         </a:effectStyle>
         <a:effectStyle>
-          <a:effectLst>
-            <a:outerShdw sx="100000" sy="100000" kx="0" ky="0" algn="b" rotWithShape="0" blurRad="38100" dist="20000" dir="5400000">
-              <a:srgbClr val="000000">
-                <a:alpha val="38000"/>
-              </a:srgbClr>
-            </a:outerShdw>
-          </a:effectLst>
+          <a:effectLst/>
         </a:effectStyle>
       </a:effectStyleLst>
       <a:bgFillStyleLst>
@@ -6642,10 +7631,10 @@
             </a:solidFill>
             <a:effectLst/>
             <a:uFillTx/>
-            <a:latin typeface="Cambria"/>
-            <a:ea typeface="Cambria"/>
-            <a:cs typeface="Cambria"/>
-            <a:sym typeface="Cambria"/>
+            <a:latin typeface="+mn-lt"/>
+            <a:ea typeface="+mn-ea"/>
+            <a:cs typeface="+mn-cs"/>
+            <a:sym typeface="Helvetica Neue"/>
           </a:defRPr>
         </a:defPPr>
         <a:lvl1pPr marL="0" marR="0" indent="0" algn="l" defTabSz="914400" rtl="0" fontAlgn="auto" latinLnBrk="1" hangingPunct="0">
@@ -6900,13 +7889,7 @@
           <a:prstDash val="solid"/>
           <a:round/>
         </a:ln>
-        <a:effectLst>
-          <a:outerShdw sx="100000" sy="100000" kx="0" ky="0" algn="b" rotWithShape="0" blurRad="38100" dist="20000" dir="5400000">
-            <a:srgbClr val="000000">
-              <a:alpha val="38000"/>
-            </a:srgbClr>
-          </a:outerShdw>
-        </a:effectLst>
+        <a:effectLst/>
         <a:sp3d/>
       </a:spPr>
       <a:bodyPr rot="0" spcFirstLastPara="1" vertOverflow="overflow" horzOverflow="overflow" vert="horz" wrap="square" lIns="91439" tIns="45719" rIns="91439" bIns="45719" numCol="1" spcCol="38100" rtlCol="0" anchor="t" upright="0">
@@ -7219,10 +8202,10 @@
             </a:solidFill>
             <a:effectLst/>
             <a:uFillTx/>
-            <a:latin typeface="Cambria"/>
-            <a:ea typeface="Cambria"/>
-            <a:cs typeface="Cambria"/>
-            <a:sym typeface="Cambria"/>
+            <a:latin typeface="+mn-lt"/>
+            <a:ea typeface="+mn-ea"/>
+            <a:cs typeface="+mn-cs"/>
+            <a:sym typeface="Helvetica Neue"/>
           </a:defRPr>
         </a:defPPr>
         <a:lvl1pPr marL="0" marR="0" indent="0" algn="l" defTabSz="914400" rtl="0" fontAlgn="auto" latinLnBrk="1" hangingPunct="0">

</xml_diff>

<commit_message>
remove all regional rules in documentation
</commit_message>
<xml_diff>
--- a/paper/accounting_agents_paper.docx
+++ b/paper/accounting_agents_paper.docx
@@ -1543,45 +1543,26 @@
             </w14:solidFill>
           </w14:textFill>
         </w:rPr>
-        <w:t>. However, these systems are opaque, expensive for small firms, and not calibrated to regional regulatory contexts (e.g., Canadian GST/HST, Revenu Qu</w:t>
-      </w:r>
-      <w:r>
-        <w:rPr>
-          <w:b w:val="0"/>
-          <w:bCs w:val="0"/>
-          <w:outline w:val="0"/>
-          <w:color w:val="000000"/>
-          <w:sz w:val="20"/>
-          <w:szCs w:val="20"/>
-          <w:u w:color="000000"/>
-          <w:rtl w:val="0"/>
-          <w:lang w:val="fr-FR"/>
-          <w14:textFill>
-            <w14:solidFill>
-              <w14:srgbClr w14:val="000000"/>
-            </w14:solidFill>
-          </w14:textFill>
-        </w:rPr>
-        <w:t>é</w:t>
-      </w:r>
-      <w:r>
-        <w:rPr>
-          <w:b w:val="0"/>
-          <w:bCs w:val="0"/>
-          <w:outline w:val="0"/>
-          <w:color w:val="000000"/>
-          <w:sz w:val="20"/>
-          <w:szCs w:val="20"/>
-          <w:u w:color="000000"/>
-          <w:rtl w:val="0"/>
-          <w:lang w:val="en-US"/>
-          <w14:textFill>
-            <w14:solidFill>
-              <w14:srgbClr w14:val="000000"/>
-            </w14:solidFill>
-          </w14:textFill>
-        </w:rPr>
-        <w:t xml:space="preserve">bec). On the open-source side, panaversity/accounts_ai </w:t>
+        <w:t>. However, these systems are opaque, expensive for small firms, and tightly coupled to the vendor’s own regulatory interpretations — leaving no room for jurisdiction-specific customization or third-party extensibility</w:t>
+      </w:r>
+      <w:r>
+        <w:rPr>
+          <w:b w:val="0"/>
+          <w:bCs w:val="0"/>
+          <w:outline w:val="0"/>
+          <w:color w:val="000000"/>
+          <w:sz w:val="20"/>
+          <w:szCs w:val="20"/>
+          <w:u w:color="000000"/>
+          <w:rtl w:val="0"/>
+          <w:lang w:val="en-US"/>
+          <w14:textFill>
+            <w14:solidFill>
+              <w14:srgbClr w14:val="000000"/>
+            </w14:solidFill>
+          </w14:textFill>
+        </w:rPr>
+        <w:t xml:space="preserve">. On the open-source side, panaversity/accounts_ai </w:t>
       </w:r>
       <w:r>
         <w:rPr>
@@ -6191,45 +6172,7 @@
             </w14:solidFill>
           </w14:textFill>
         </w:rPr>
-        <w:t>The present work is a position paper describing framework design. Several limitations apply. First, we present no experimental results; a companion implementation paper will evaluate agent accuracy, HITL approval rates, and time savings against a baseline of manual processing. Second, the four-level escalation thresholds are defined heuristically; future work should calibrate these empirically per firm profile. Third, the framework currently targets QBO; extension to Xero, Sage, and Microsoft Dynamics 365 would broaden applicability. Fourth, Canadian regulatory specifics (GST/HST, Revenu Qu</w:t>
-      </w:r>
-      <w:r>
-        <w:rPr>
-          <w:b w:val="0"/>
-          <w:bCs w:val="0"/>
-          <w:outline w:val="0"/>
-          <w:color w:val="000000"/>
-          <w:sz w:val="20"/>
-          <w:szCs w:val="20"/>
-          <w:u w:color="000000"/>
-          <w:rtl w:val="0"/>
-          <w:lang w:val="fr-FR"/>
-          <w14:textFill>
-            <w14:solidFill>
-              <w14:srgbClr w14:val="000000"/>
-            </w14:solidFill>
-          </w14:textFill>
-        </w:rPr>
-        <w:t>é</w:t>
-      </w:r>
-      <w:r>
-        <w:rPr>
-          <w:b w:val="0"/>
-          <w:bCs w:val="0"/>
-          <w:outline w:val="0"/>
-          <w:color w:val="000000"/>
-          <w:sz w:val="20"/>
-          <w:szCs w:val="20"/>
-          <w:u w:color="000000"/>
-          <w:rtl w:val="0"/>
-          <w:lang w:val="en-US"/>
-          <w14:textFill>
-            <w14:solidFill>
-              <w14:srgbClr w14:val="000000"/>
-            </w14:solidFill>
-          </w14:textFill>
-        </w:rPr>
-        <w:t>bec) are noted as a design consideration but not yet implemented as explicit compliance rules.</w:t>
+        <w:t>The present work is a position paper describing framework design. Several limitations apply. First, we present no experimental results; a companion implementation paper will evaluate agent accuracy, HITL approval rates, and time savings against a baseline of manual processing. Second, the four-level escalation thresholds are defined heuristically; future work should calibrate these empirically per firm profile. Third, the framework currently targets QBO; extension to Xero, Sage, and Microsoft Dynamics 365 would broaden applicability. Fourth, AccountingAgents acts as a jurisdiction-agnostic orchestration layer — regulatory and fiscal specifics remain the responsibility of the underlying accounting software (QBO, Xero, Sage). Extension to additional MCP-compatible accounting backends would broaden applicability across jurisdictions without modifying agent logic.</w:t>
       </w:r>
     </w:p>
     <w:p>

</xml_diff>

<commit_message>
added Deployment Considerations: LLM Provider and Data Sovereignty
</commit_message>
<xml_diff>
--- a/paper/accounting_agents_paper.docx
+++ b/paper/accounting_agents_paper.docx
@@ -7275,6 +7275,66 @@
         <w:pStyle w:val="Heading"/>
         <w:spacing w:before="240"/>
         <w:rPr>
+          <w:lang w:val="en-US"/>
+        </w:rPr>
+      </w:pPr>
+      <w:r>
+        <w:t xml:space="preserve">8. Deployment Considerations</w:t>
+      </w:r>
+    </w:p>
+    <w:p>
+      <w:pPr>
+        <w:pStyle w:val="Heading"/>
+        <w:spacing w:before="240"/>
+        <w:rPr>
+          <w:lang w:val="en-US"/>
+        </w:rPr>
+      </w:pPr>
+      <w:r>
+        <w:t xml:space="preserve">LLM Provider and Data Sovereignty</w:t>
+      </w:r>
+    </w:p>
+    <w:p>
+      <w:pPr>
+        <w:pStyle w:val="Heading"/>
+        <w:spacing w:before="240"/>
+        <w:rPr>
+          <w:lang w:val="en-US"/>
+        </w:rPr>
+      </w:pPr>
+      <w:r>
+        <w:t>AccountingAgents currently uses a cloud-based LLM API for document classification (CLASSIFICATION_MODE=llm). In a production deployment handling real accounting client data, practitioners must evaluate the data residency implications of their chosen LLM provider. Accounting firms are subject to strict confidentiality obligations and, depending on jurisdiction, to data sovereignty regulations that restrict cross-border transfer of personal financial information (e.g., Quebec Law 25, GDPR, Australia Privacy Act).</w:t>
+      </w:r>
+    </w:p>
+    <w:p>
+      <w:pPr>
+        <w:pStyle w:val="Heading"/>
+        <w:spacing w:before="240"/>
+        <w:rPr>
+          <w:lang w:val="en-US"/>
+        </w:rPr>
+      </w:pPr>
+      <w:r>
+        <w:t>The recommended production pattern is to use a regionally-hosted inference endpoint — such as a cloud provider’s local region — ensuring client data remains within the required jurisdiction. This is a meaningful differentiator relative to commercial solutions such as Intuit Assist, which route client financial data through a single centralized infrastructure with no data residency option.</w:t>
+      </w:r>
+    </w:p>
+    <w:p>
+      <w:pPr>
+        <w:pStyle w:val="Heading"/>
+        <w:spacing w:before="240"/>
+        <w:rPr>
+          <w:lang w:val="en-US"/>
+        </w:rPr>
+      </w:pPr>
+      <w:r>
+        <w:t>The CLASSIFICATION_MODEL environment variable in AccountingAgents is already configurable, making migration to any hosted model a minimal code change. LLM provider selection is treated as a deployment concern, not an architectural one — a deliberate design decision to support multi-jurisdiction deployments.</w:t>
+      </w:r>
+    </w:p>
+    <w:p>
+      <w:pPr>
+        <w:pStyle w:val="Heading"/>
+        <w:spacing w:before="240"/>
+        <w:rPr>
           <w:lang w:val="it-IT"/>
         </w:rPr>
       </w:pPr>
@@ -7283,7 +7343,7 @@
           <w:rtl w:val="0"/>
           <w:lang w:val="it-IT"/>
         </w:rPr>
-        <w:t>8. Conclusion</w:t>
+        <w:t>9. Conclusion</w:t>
       </w:r>
     </w:p>
     <w:p>

</xml_diff>